<commit_message>
Completed core authentication and client dashboard
</commit_message>
<xml_diff>
--- a/Pothik Bondhu Hajj & Umrah Agency.docx
+++ b/Pothik Bondhu Hajj & Umrah Agency.docx
@@ -154,7 +154,7 @@
       <w:bookmarkStart w:id="2" w:name="_Toc346508722"/>
       <w:bookmarkStart w:id="3" w:name="_Toc346508952"/>
       <w:bookmarkStart w:id="4" w:name="_Toc346509227"/>
-      <w:bookmarkStart w:id="5" w:name="_Toc228476151"/>
+      <w:bookmarkStart w:id="5" w:name="_Toc228688710"/>
       <w:bookmarkEnd w:id="0"/>
       <w:bookmarkEnd w:id="1"/>
       <w:bookmarkEnd w:id="2"/>
@@ -208,7 +208,7 @@
         <w:fldChar w:fldCharType="begin"/>
       </w:r>
       <w:r>
-        <w:instrText xml:space="preserve"> PAGEREF _Toc228476151 \h </w:instrText>
+        <w:instrText xml:space="preserve"> PAGEREF _Toc228688710 \h </w:instrText>
       </w:r>
       <w:r>
         <w:fldChar w:fldCharType="separate"/>
@@ -241,7 +241,7 @@
         <w:fldChar w:fldCharType="begin"/>
       </w:r>
       <w:r>
-        <w:instrText xml:space="preserve"> PAGEREF _Toc228476152 \h </w:instrText>
+        <w:instrText xml:space="preserve"> PAGEREF _Toc228688711 \h </w:instrText>
       </w:r>
       <w:r>
         <w:fldChar w:fldCharType="separate"/>
@@ -287,7 +287,7 @@
         <w:fldChar w:fldCharType="begin"/>
       </w:r>
       <w:r>
-        <w:instrText xml:space="preserve"> PAGEREF _Toc228476153 \h </w:instrText>
+        <w:instrText xml:space="preserve"> PAGEREF _Toc228688712 \h </w:instrText>
       </w:r>
       <w:r>
         <w:fldChar w:fldCharType="separate"/>
@@ -353,7 +353,7 @@
         <w:rPr>
           <w:noProof/>
         </w:rPr>
-        <w:instrText xml:space="preserve"> PAGEREF _Toc228476154 \h </w:instrText>
+        <w:instrText xml:space="preserve"> PAGEREF _Toc228688713 \h </w:instrText>
       </w:r>
       <w:r>
         <w:rPr>
@@ -433,7 +433,7 @@
         <w:rPr>
           <w:noProof/>
         </w:rPr>
-        <w:instrText xml:space="preserve"> PAGEREF _Toc228476155 \h </w:instrText>
+        <w:instrText xml:space="preserve"> PAGEREF _Toc228688714 \h </w:instrText>
       </w:r>
       <w:r>
         <w:rPr>
@@ -513,7 +513,7 @@
         <w:rPr>
           <w:noProof/>
         </w:rPr>
-        <w:instrText xml:space="preserve"> PAGEREF _Toc228476156 \h </w:instrText>
+        <w:instrText xml:space="preserve"> PAGEREF _Toc228688715 \h </w:instrText>
       </w:r>
       <w:r>
         <w:rPr>
@@ -593,7 +593,7 @@
         <w:rPr>
           <w:noProof/>
         </w:rPr>
-        <w:instrText xml:space="preserve"> PAGEREF _Toc228476157 \h </w:instrText>
+        <w:instrText xml:space="preserve"> PAGEREF _Toc228688716 \h </w:instrText>
       </w:r>
       <w:r>
         <w:rPr>
@@ -673,7 +673,7 @@
         <w:rPr>
           <w:noProof/>
         </w:rPr>
-        <w:instrText xml:space="preserve"> PAGEREF _Toc228476158 \h </w:instrText>
+        <w:instrText xml:space="preserve"> PAGEREF _Toc228688717 \h </w:instrText>
       </w:r>
       <w:r>
         <w:rPr>
@@ -733,7 +733,7 @@
         <w:fldChar w:fldCharType="begin"/>
       </w:r>
       <w:r>
-        <w:instrText xml:space="preserve"> PAGEREF _Toc228476159 \h </w:instrText>
+        <w:instrText xml:space="preserve"> PAGEREF _Toc228688718 \h </w:instrText>
       </w:r>
       <w:r>
         <w:fldChar w:fldCharType="separate"/>
@@ -799,7 +799,7 @@
         <w:rPr>
           <w:noProof/>
         </w:rPr>
-        <w:instrText xml:space="preserve"> PAGEREF _Toc228476160 \h </w:instrText>
+        <w:instrText xml:space="preserve"> PAGEREF _Toc228688719 \h </w:instrText>
       </w:r>
       <w:r>
         <w:rPr>
@@ -879,7 +879,7 @@
         <w:rPr>
           <w:noProof/>
         </w:rPr>
-        <w:instrText xml:space="preserve"> PAGEREF _Toc228476161 \h </w:instrText>
+        <w:instrText xml:space="preserve"> PAGEREF _Toc228688720 \h </w:instrText>
       </w:r>
       <w:r>
         <w:rPr>
@@ -959,7 +959,7 @@
         <w:rPr>
           <w:noProof/>
         </w:rPr>
-        <w:instrText xml:space="preserve"> PAGEREF _Toc228476162 \h </w:instrText>
+        <w:instrText xml:space="preserve"> PAGEREF _Toc228688721 \h </w:instrText>
       </w:r>
       <w:r>
         <w:rPr>
@@ -1039,7 +1039,7 @@
         <w:rPr>
           <w:noProof/>
         </w:rPr>
-        <w:instrText xml:space="preserve"> PAGEREF _Toc228476163 \h </w:instrText>
+        <w:instrText xml:space="preserve"> PAGEREF _Toc228688722 \h </w:instrText>
       </w:r>
       <w:r>
         <w:rPr>
@@ -1119,7 +1119,7 @@
         <w:rPr>
           <w:noProof/>
         </w:rPr>
-        <w:instrText xml:space="preserve"> PAGEREF _Toc228476164 \h </w:instrText>
+        <w:instrText xml:space="preserve"> PAGEREF _Toc228688723 \h </w:instrText>
       </w:r>
       <w:r>
         <w:rPr>
@@ -1136,7 +1136,7 @@
         <w:rPr>
           <w:noProof/>
         </w:rPr>
-        <w:t>2</w:t>
+        <w:t>3</w:t>
       </w:r>
       <w:r>
         <w:rPr>
@@ -1199,7 +1199,7 @@
         <w:rPr>
           <w:noProof/>
         </w:rPr>
-        <w:instrText xml:space="preserve"> PAGEREF _Toc228476165 \h </w:instrText>
+        <w:instrText xml:space="preserve"> PAGEREF _Toc228688724 \h </w:instrText>
       </w:r>
       <w:r>
         <w:rPr>
@@ -1216,7 +1216,7 @@
         <w:rPr>
           <w:noProof/>
         </w:rPr>
-        <w:t>2</w:t>
+        <w:t>3</w:t>
       </w:r>
       <w:r>
         <w:rPr>
@@ -1279,7 +1279,7 @@
         <w:rPr>
           <w:noProof/>
         </w:rPr>
-        <w:instrText xml:space="preserve"> PAGEREF _Toc228476166 \h </w:instrText>
+        <w:instrText xml:space="preserve"> PAGEREF _Toc228688725 \h </w:instrText>
       </w:r>
       <w:r>
         <w:rPr>
@@ -1296,7 +1296,7 @@
         <w:rPr>
           <w:noProof/>
         </w:rPr>
-        <w:t>2</w:t>
+        <w:t>3</w:t>
       </w:r>
       <w:r>
         <w:rPr>
@@ -1339,7 +1339,7 @@
         <w:fldChar w:fldCharType="begin"/>
       </w:r>
       <w:r>
-        <w:instrText xml:space="preserve"> PAGEREF _Toc228476167 \h </w:instrText>
+        <w:instrText xml:space="preserve"> PAGEREF _Toc228688726 \h </w:instrText>
       </w:r>
       <w:r>
         <w:fldChar w:fldCharType="separate"/>
@@ -1405,7 +1405,7 @@
         <w:rPr>
           <w:noProof/>
         </w:rPr>
-        <w:instrText xml:space="preserve"> PAGEREF _Toc228476168 \h </w:instrText>
+        <w:instrText xml:space="preserve"> PAGEREF _Toc228688727 \h </w:instrText>
       </w:r>
       <w:r>
         <w:rPr>
@@ -1485,7 +1485,7 @@
         <w:rPr>
           <w:noProof/>
         </w:rPr>
-        <w:instrText xml:space="preserve"> PAGEREF _Toc228476169 \h </w:instrText>
+        <w:instrText xml:space="preserve"> PAGEREF _Toc228688728 \h </w:instrText>
       </w:r>
       <w:r>
         <w:rPr>
@@ -1502,7 +1502,7 @@
         <w:rPr>
           <w:noProof/>
         </w:rPr>
-        <w:t>3</w:t>
+        <w:t>5</w:t>
       </w:r>
       <w:r>
         <w:rPr>
@@ -1565,7 +1565,7 @@
         <w:rPr>
           <w:noProof/>
         </w:rPr>
-        <w:instrText xml:space="preserve"> PAGEREF _Toc228476170 \h </w:instrText>
+        <w:instrText xml:space="preserve"> PAGEREF _Toc228688729 \h </w:instrText>
       </w:r>
       <w:r>
         <w:rPr>
@@ -1582,7 +1582,7 @@
         <w:rPr>
           <w:noProof/>
         </w:rPr>
-        <w:t>3</w:t>
+        <w:t>5</w:t>
       </w:r>
       <w:r>
         <w:rPr>
@@ -1645,7 +1645,7 @@
         <w:rPr>
           <w:noProof/>
         </w:rPr>
-        <w:instrText xml:space="preserve"> PAGEREF _Toc228476171 \h </w:instrText>
+        <w:instrText xml:space="preserve"> PAGEREF _Toc228688730 \h </w:instrText>
       </w:r>
       <w:r>
         <w:rPr>
@@ -1662,7 +1662,7 @@
         <w:rPr>
           <w:noProof/>
         </w:rPr>
-        <w:t>3</w:t>
+        <w:t>6</w:t>
       </w:r>
       <w:r>
         <w:rPr>
@@ -1705,13 +1705,13 @@
         <w:fldChar w:fldCharType="begin"/>
       </w:r>
       <w:r>
-        <w:instrText xml:space="preserve"> PAGEREF _Toc228476172 \h </w:instrText>
+        <w:instrText xml:space="preserve"> PAGEREF _Toc228688731 \h </w:instrText>
       </w:r>
       <w:r>
         <w:fldChar w:fldCharType="separate"/>
       </w:r>
       <w:r>
-        <w:t>3</w:t>
+        <w:t>6</w:t>
       </w:r>
       <w:r>
         <w:fldChar w:fldCharType="end"/>
@@ -1771,7 +1771,7 @@
         <w:rPr>
           <w:noProof/>
         </w:rPr>
-        <w:instrText xml:space="preserve"> PAGEREF _Toc228476173 \h </w:instrText>
+        <w:instrText xml:space="preserve"> PAGEREF _Toc228688732 \h </w:instrText>
       </w:r>
       <w:r>
         <w:rPr>
@@ -1788,7 +1788,7 @@
         <w:rPr>
           <w:noProof/>
         </w:rPr>
-        <w:t>4</w:t>
+        <w:t>6</w:t>
       </w:r>
       <w:r>
         <w:rPr>
@@ -1851,7 +1851,7 @@
         <w:rPr>
           <w:noProof/>
         </w:rPr>
-        <w:instrText xml:space="preserve"> PAGEREF _Toc228476174 \h </w:instrText>
+        <w:instrText xml:space="preserve"> PAGEREF _Toc228688733 \h </w:instrText>
       </w:r>
       <w:r>
         <w:rPr>
@@ -1868,7 +1868,7 @@
         <w:rPr>
           <w:noProof/>
         </w:rPr>
-        <w:t>4</w:t>
+        <w:t>6</w:t>
       </w:r>
       <w:r>
         <w:rPr>
@@ -1911,13 +1911,13 @@
         <w:fldChar w:fldCharType="begin"/>
       </w:r>
       <w:r>
-        <w:instrText xml:space="preserve"> PAGEREF _Toc228476175 \h </w:instrText>
+        <w:instrText xml:space="preserve"> PAGEREF _Toc228688734 \h </w:instrText>
       </w:r>
       <w:r>
         <w:fldChar w:fldCharType="separate"/>
       </w:r>
       <w:r>
-        <w:t>4</w:t>
+        <w:t>6</w:t>
       </w:r>
       <w:r>
         <w:fldChar w:fldCharType="end"/>
@@ -1977,7 +1977,7 @@
         <w:rPr>
           <w:noProof/>
         </w:rPr>
-        <w:instrText xml:space="preserve"> PAGEREF _Toc228476176 \h </w:instrText>
+        <w:instrText xml:space="preserve"> PAGEREF _Toc228688735 \h </w:instrText>
       </w:r>
       <w:r>
         <w:rPr>
@@ -1994,7 +1994,7 @@
         <w:rPr>
           <w:noProof/>
         </w:rPr>
-        <w:t>4</w:t>
+        <w:t>6</w:t>
       </w:r>
       <w:r>
         <w:rPr>
@@ -2057,7 +2057,7 @@
         <w:rPr>
           <w:noProof/>
         </w:rPr>
-        <w:instrText xml:space="preserve"> PAGEREF _Toc228476177 \h </w:instrText>
+        <w:instrText xml:space="preserve"> PAGEREF _Toc228688736 \h </w:instrText>
       </w:r>
       <w:r>
         <w:rPr>
@@ -2074,7 +2074,7 @@
         <w:rPr>
           <w:noProof/>
         </w:rPr>
-        <w:t>4</w:t>
+        <w:t>6</w:t>
       </w:r>
       <w:r>
         <w:rPr>
@@ -2137,7 +2137,7 @@
         <w:rPr>
           <w:noProof/>
         </w:rPr>
-        <w:instrText xml:space="preserve"> PAGEREF _Toc228476178 \h </w:instrText>
+        <w:instrText xml:space="preserve"> PAGEREF _Toc228688737 \h </w:instrText>
       </w:r>
       <w:r>
         <w:rPr>
@@ -2154,7 +2154,7 @@
         <w:rPr>
           <w:noProof/>
         </w:rPr>
-        <w:t>5</w:t>
+        <w:t>6</w:t>
       </w:r>
       <w:r>
         <w:rPr>
@@ -2217,7 +2217,7 @@
         <w:rPr>
           <w:noProof/>
         </w:rPr>
-        <w:instrText xml:space="preserve"> PAGEREF _Toc228476179 \h </w:instrText>
+        <w:instrText xml:space="preserve"> PAGEREF _Toc228688738 \h </w:instrText>
       </w:r>
       <w:r>
         <w:rPr>
@@ -2234,7 +2234,7 @@
         <w:rPr>
           <w:noProof/>
         </w:rPr>
-        <w:t>5</w:t>
+        <w:t>7</w:t>
       </w:r>
       <w:r>
         <w:rPr>
@@ -2297,7 +2297,7 @@
         <w:rPr>
           <w:noProof/>
         </w:rPr>
-        <w:instrText xml:space="preserve"> PAGEREF _Toc228476180 \h </w:instrText>
+        <w:instrText xml:space="preserve"> PAGEREF _Toc228688739 \h </w:instrText>
       </w:r>
       <w:r>
         <w:rPr>
@@ -2314,7 +2314,7 @@
         <w:rPr>
           <w:noProof/>
         </w:rPr>
-        <w:t>5</w:t>
+        <w:t>7</w:t>
       </w:r>
       <w:r>
         <w:rPr>
@@ -2357,13 +2357,13 @@
         <w:fldChar w:fldCharType="begin"/>
       </w:r>
       <w:r>
-        <w:instrText xml:space="preserve"> PAGEREF _Toc228476181 \h </w:instrText>
+        <w:instrText xml:space="preserve"> PAGEREF _Toc228688740 \h </w:instrText>
       </w:r>
       <w:r>
         <w:fldChar w:fldCharType="separate"/>
       </w:r>
       <w:r>
-        <w:t>5</w:t>
+        <w:t>7</w:t>
       </w:r>
       <w:r>
         <w:fldChar w:fldCharType="end"/>
@@ -2390,13 +2390,13 @@
         <w:fldChar w:fldCharType="begin"/>
       </w:r>
       <w:r>
-        <w:instrText xml:space="preserve"> PAGEREF _Toc228476182 \h </w:instrText>
+        <w:instrText xml:space="preserve"> PAGEREF _Toc228688741 \h </w:instrText>
       </w:r>
       <w:r>
         <w:fldChar w:fldCharType="separate"/>
       </w:r>
       <w:r>
-        <w:t>5</w:t>
+        <w:t>7</w:t>
       </w:r>
       <w:r>
         <w:fldChar w:fldCharType="end"/>
@@ -2423,13 +2423,13 @@
         <w:fldChar w:fldCharType="begin"/>
       </w:r>
       <w:r>
-        <w:instrText xml:space="preserve"> PAGEREF _Toc228476183 \h </w:instrText>
+        <w:instrText xml:space="preserve"> PAGEREF _Toc228688742 \h </w:instrText>
       </w:r>
       <w:r>
         <w:fldChar w:fldCharType="separate"/>
       </w:r>
       <w:r>
-        <w:t>5</w:t>
+        <w:t>7</w:t>
       </w:r>
       <w:r>
         <w:fldChar w:fldCharType="end"/>
@@ -2456,13 +2456,13 @@
         <w:fldChar w:fldCharType="begin"/>
       </w:r>
       <w:r>
-        <w:instrText xml:space="preserve"> PAGEREF _Toc228476184 \h </w:instrText>
+        <w:instrText xml:space="preserve"> PAGEREF _Toc228688743 \h </w:instrText>
       </w:r>
       <w:r>
         <w:fldChar w:fldCharType="separate"/>
       </w:r>
       <w:r>
-        <w:t>5</w:t>
+        <w:t>7</w:t>
       </w:r>
       <w:r>
         <w:fldChar w:fldCharType="end"/>
@@ -2498,7 +2498,7 @@
       <w:pPr>
         <w:pStyle w:val="TOCEntry"/>
       </w:pPr>
-      <w:bookmarkStart w:id="6" w:name="_Toc228476152"/>
+      <w:bookmarkStart w:id="6" w:name="_Toc228688711"/>
       <w:r>
         <w:t>Revision History</w:t>
       </w:r>
@@ -2525,12 +2525,6 @@
         <w:gridCol w:w="1584"/>
       </w:tblGrid>
       <w:tr>
-        <w:tblPrEx>
-          <w:tblCellMar>
-            <w:top w:w="0" w:type="dxa"/>
-            <w:bottom w:w="0" w:type="dxa"/>
-          </w:tblCellMar>
-        </w:tblPrEx>
         <w:tc>
           <w:tcPr>
             <w:tcW w:w="2160" w:type="dxa"/>
@@ -2625,12 +2619,6 @@
         </w:tc>
       </w:tr>
       <w:tr>
-        <w:tblPrEx>
-          <w:tblCellMar>
-            <w:top w:w="0" w:type="dxa"/>
-            <w:bottom w:w="0" w:type="dxa"/>
-          </w:tblCellMar>
-        </w:tblPrEx>
         <w:tc>
           <w:tcPr>
             <w:tcW w:w="2160" w:type="dxa"/>
@@ -2685,12 +2673,6 @@
         </w:tc>
       </w:tr>
       <w:tr>
-        <w:tblPrEx>
-          <w:tblCellMar>
-            <w:top w:w="0" w:type="dxa"/>
-            <w:bottom w:w="0" w:type="dxa"/>
-          </w:tblCellMar>
-        </w:tblPrEx>
         <w:tc>
           <w:tcPr>
             <w:tcW w:w="2160" w:type="dxa"/>
@@ -2769,7 +2751,7 @@
         <w:pStyle w:val="Heading1"/>
       </w:pPr>
       <w:bookmarkStart w:id="7" w:name="_Toc439994665"/>
-      <w:bookmarkStart w:id="8" w:name="_Toc228476153"/>
+      <w:bookmarkStart w:id="8" w:name="_Toc228688712"/>
       <w:r>
         <w:lastRenderedPageBreak/>
         <w:t>Introduction</w:t>
@@ -2782,7 +2764,7 @@
         <w:pStyle w:val="Heading2"/>
       </w:pPr>
       <w:bookmarkStart w:id="9" w:name="_Toc439994667"/>
-      <w:bookmarkStart w:id="10" w:name="_Toc228476154"/>
+      <w:bookmarkStart w:id="10" w:name="_Toc228688713"/>
       <w:r>
         <w:t>Purpose</w:t>
       </w:r>
@@ -2820,7 +2802,7 @@
       <w:pPr>
         <w:pStyle w:val="Heading2"/>
       </w:pPr>
-      <w:bookmarkStart w:id="11" w:name="_Toc228476155"/>
+      <w:bookmarkStart w:id="11" w:name="_Toc228688714"/>
       <w:r>
         <w:t>Motivation</w:t>
       </w:r>
@@ -2868,7 +2850,7 @@
       <w:pPr>
         <w:pStyle w:val="Heading2"/>
       </w:pPr>
-      <w:bookmarkStart w:id="12" w:name="_Toc228476156"/>
+      <w:bookmarkStart w:id="12" w:name="_Toc228688715"/>
       <w:r>
         <w:t>Objectives</w:t>
       </w:r>
@@ -2911,7 +2893,7 @@
         <w:pStyle w:val="Heading2"/>
       </w:pPr>
       <w:bookmarkStart w:id="13" w:name="_Toc439994670"/>
-      <w:bookmarkStart w:id="14" w:name="_Toc228476157"/>
+      <w:bookmarkStart w:id="14" w:name="_Toc228688716"/>
       <w:r>
         <w:t>Product Scope</w:t>
       </w:r>
@@ -2934,7 +2916,7 @@
         <w:pStyle w:val="Heading2"/>
       </w:pPr>
       <w:bookmarkStart w:id="15" w:name="_Toc439994672"/>
-      <w:bookmarkStart w:id="16" w:name="_Toc228476158"/>
+      <w:bookmarkStart w:id="16" w:name="_Toc228688717"/>
       <w:r>
         <w:t>References</w:t>
       </w:r>
@@ -2957,7 +2939,7 @@
         <w:pStyle w:val="Heading1"/>
       </w:pPr>
       <w:bookmarkStart w:id="17" w:name="_Toc439994673"/>
-      <w:bookmarkStart w:id="18" w:name="_Toc228476159"/>
+      <w:bookmarkStart w:id="18" w:name="_Toc228688718"/>
       <w:r>
         <w:t>Overall Description</w:t>
       </w:r>
@@ -2969,7 +2951,7 @@
         <w:pStyle w:val="Heading2"/>
       </w:pPr>
       <w:bookmarkStart w:id="19" w:name="_Toc439994674"/>
-      <w:bookmarkStart w:id="20" w:name="_Toc228476160"/>
+      <w:bookmarkStart w:id="20" w:name="_Toc228688719"/>
       <w:r>
         <w:t>Product Perspective</w:t>
       </w:r>
@@ -2980,12 +2962,77 @@
       <w:pPr>
         <w:pStyle w:val="template"/>
       </w:pPr>
-      <w:r>
-        <w:t xml:space="preserve">&lt;Describe the context and origin of the product being specified in this SRS. For example, state whether this product is a follow-on member of a product family, a replacement for certain existing </w:t>
-      </w:r>
-      <w:r>
+      <w:proofErr w:type="spellStart"/>
+      <w:r>
+        <w:t>Pothik</w:t>
+      </w:r>
+      <w:proofErr w:type="spellEnd"/>
+      <w:r>
+        <w:t xml:space="preserve"> Bondhu is an independent, web-based travel agency management system. It operates as a centralized platform designed to streamline operations and logistics between travel agencies, their </w:t>
+      </w:r>
+      <w:r>
+        <w:rPr>
+          <w:noProof/>
+        </w:rPr>
         <w:lastRenderedPageBreak/>
-        <w:t>systems, or a new, self-contained product. If the SRS defines a component of a larger system, relate the requirements of the larger system to the functionality of this software and identify interfaces between the two. A simple diagram that shows the major components of the overall system, subsystem interconnections, and external interfaces can be helpful.&gt;</w:t>
+        <w:drawing>
+          <wp:anchor distT="0" distB="0" distL="114300" distR="114300" simplePos="0" relativeHeight="251658240" behindDoc="0" locked="0" layoutInCell="1" allowOverlap="1" wp14:anchorId="67DE0AA6" wp14:editId="53ADAE39">
+            <wp:simplePos x="822960" y="-480060"/>
+            <wp:positionH relativeFrom="margin">
+              <wp:align>left</wp:align>
+            </wp:positionH>
+            <wp:positionV relativeFrom="margin">
+              <wp:align>top</wp:align>
+            </wp:positionV>
+            <wp:extent cx="6400800" cy="3526790"/>
+            <wp:effectExtent l="0" t="0" r="0" b="0"/>
+            <wp:wrapSquare wrapText="bothSides"/>
+            <wp:docPr id="123287033" name="Picture 2"/>
+            <wp:cNvGraphicFramePr>
+              <a:graphicFrameLocks xmlns:a="http://schemas.openxmlformats.org/drawingml/2006/main" noChangeAspect="1"/>
+            </wp:cNvGraphicFramePr>
+            <a:graphic xmlns:a="http://schemas.openxmlformats.org/drawingml/2006/main">
+              <a:graphicData uri="http://schemas.openxmlformats.org/drawingml/2006/picture">
+                <pic:pic xmlns:pic="http://schemas.openxmlformats.org/drawingml/2006/picture">
+                  <pic:nvPicPr>
+                    <pic:cNvPr id="123287033" name="Picture 123287033"/>
+                    <pic:cNvPicPr/>
+                  </pic:nvPicPr>
+                  <pic:blipFill>
+                    <a:blip r:embed="rId10" cstate="print">
+                      <a:extLst>
+                        <a:ext uri="{28A0092B-C50C-407E-A947-70E740481C1C}">
+                          <a14:useLocalDpi xmlns:a14="http://schemas.microsoft.com/office/drawing/2010/main" val="0"/>
+                        </a:ext>
+                      </a:extLst>
+                    </a:blip>
+                    <a:stretch>
+                      <a:fillRect/>
+                    </a:stretch>
+                  </pic:blipFill>
+                  <pic:spPr>
+                    <a:xfrm>
+                      <a:off x="0" y="0"/>
+                      <a:ext cx="6437592" cy="3547062"/>
+                    </a:xfrm>
+                    <a:prstGeom prst="rect">
+                      <a:avLst/>
+                    </a:prstGeom>
+                  </pic:spPr>
+                </pic:pic>
+              </a:graphicData>
+            </a:graphic>
+            <wp14:sizeRelH relativeFrom="margin">
+              <wp14:pctWidth>0</wp14:pctWidth>
+            </wp14:sizeRelH>
+            <wp14:sizeRelV relativeFrom="margin">
+              <wp14:pctHeight>0</wp14:pctHeight>
+            </wp14:sizeRelV>
+          </wp:anchor>
+        </w:drawing>
+      </w:r>
+      <w:r>
+        <w:t>regional branches, and travelers. The system follows a standard client-server architecture, utilizing a web-based frontend that communicates securely with a backend API and a centralized relational database.</w:t>
       </w:r>
     </w:p>
     <w:p>
@@ -2993,7 +3040,7 @@
         <w:pStyle w:val="Heading2"/>
       </w:pPr>
       <w:bookmarkStart w:id="21" w:name="_Toc439994675"/>
-      <w:bookmarkStart w:id="22" w:name="_Toc228476161"/>
+      <w:bookmarkStart w:id="22" w:name="_Toc228688720"/>
       <w:r>
         <w:t>Product Functions</w:t>
       </w:r>
@@ -3005,23 +3052,55 @@
         <w:pStyle w:val="template"/>
       </w:pPr>
       <w:r>
-        <w:t xml:space="preserve">&lt;Summarize the major functions the product must perform or must let the user perform. Details will be provided in Section 3, so only a </w:t>
-      </w:r>
-      <w:proofErr w:type="gramStart"/>
-      <w:r>
-        <w:t>high level</w:t>
-      </w:r>
-      <w:proofErr w:type="gramEnd"/>
-      <w:r>
-        <w:t xml:space="preserve"> summary (such as a bullet list) is needed here. Organize the functions to make them understandable to any reader of the SRS. A picture of the major groups of related requirements and how they relate, such as a </w:t>
-      </w:r>
-      <w:proofErr w:type="gramStart"/>
-      <w:r>
-        <w:t>top level</w:t>
-      </w:r>
-      <w:proofErr w:type="gramEnd"/>
-      <w:r>
-        <w:t xml:space="preserve"> data flow diagram or object class diagram, is often effective.&gt;</w:t>
+        <w:t>The primary functions of the system include:</w:t>
+      </w:r>
+    </w:p>
+    <w:p>
+      <w:pPr>
+        <w:pStyle w:val="template"/>
+        <w:numPr>
+          <w:ilvl w:val="0"/>
+          <w:numId w:val="2"/>
+        </w:numPr>
+      </w:pPr>
+      <w:r>
+        <w:t>Centralized management of travel agencies and their respective branches.</w:t>
+      </w:r>
+    </w:p>
+    <w:p>
+      <w:pPr>
+        <w:pStyle w:val="template"/>
+        <w:numPr>
+          <w:ilvl w:val="0"/>
+          <w:numId w:val="2"/>
+        </w:numPr>
+      </w:pPr>
+      <w:r>
+        <w:t>Traveler coordination and booking record management.</w:t>
+      </w:r>
+    </w:p>
+    <w:p>
+      <w:pPr>
+        <w:pStyle w:val="template"/>
+        <w:numPr>
+          <w:ilvl w:val="0"/>
+          <w:numId w:val="2"/>
+        </w:numPr>
+      </w:pPr>
+      <w:r>
+        <w:t>Role-based dashboards providing specific views and controls for administrators, agency managers, and users.</w:t>
+      </w:r>
+    </w:p>
+    <w:p>
+      <w:pPr>
+        <w:pStyle w:val="template"/>
+        <w:numPr>
+          <w:ilvl w:val="0"/>
+          <w:numId w:val="2"/>
+        </w:numPr>
+      </w:pPr>
+      <w:r>
+        <w:t>Real-time data handling for system updates and user communication.</w:t>
       </w:r>
     </w:p>
     <w:p>
@@ -3029,7 +3108,7 @@
         <w:pStyle w:val="Heading2"/>
       </w:pPr>
       <w:bookmarkStart w:id="23" w:name="_Toc439994676"/>
-      <w:bookmarkStart w:id="24" w:name="_Toc228476162"/>
+      <w:bookmarkStart w:id="24" w:name="_Toc228688721"/>
       <w:r>
         <w:t>User Classes and Characteristics</w:t>
       </w:r>
@@ -3041,7 +3120,91 @@
         <w:pStyle w:val="template"/>
       </w:pPr>
       <w:r>
-        <w:t>&lt;Identify the various user classes that you anticipate will use this product. User classes may be differentiated based on frequency of use, subset of product functions used, technical expertise, security or privilege levels, educational level, or experience. Describe the pertinent characteristics of each user class. Certain requirements may pertain only to certain user classes. Distinguish the most important user classes for this product from those who are less important to satisfy.&gt;</w:t>
+        <w:t>The system is designed for three main types of users:</w:t>
+      </w:r>
+    </w:p>
+    <w:p>
+      <w:pPr>
+        <w:pStyle w:val="template"/>
+        <w:numPr>
+          <w:ilvl w:val="0"/>
+          <w:numId w:val="3"/>
+        </w:numPr>
+      </w:pPr>
+      <w:r>
+        <w:rPr>
+          <w:b/>
+          <w:bCs/>
+        </w:rPr>
+        <w:t>System Administrator:</w:t>
+      </w:r>
+      <w:r>
+        <w:t xml:space="preserve"> Has full access to the system to onboard new agencies, manage global settings, and oversee system health. </w:t>
+      </w:r>
+      <w:r>
+        <w:rPr>
+          <w:iCs/>
+        </w:rPr>
+        <w:t>Characteristics:</w:t>
+      </w:r>
+      <w:r>
+        <w:t xml:space="preserve"> Moderate technical expertise.</w:t>
+      </w:r>
+    </w:p>
+    <w:p>
+      <w:pPr>
+        <w:pStyle w:val="template"/>
+        <w:numPr>
+          <w:ilvl w:val="0"/>
+          <w:numId w:val="3"/>
+        </w:numPr>
+      </w:pPr>
+      <w:r>
+        <w:rPr>
+          <w:b/>
+          <w:bCs/>
+        </w:rPr>
+        <w:t>Agency/Branch Manager:</w:t>
+      </w:r>
+      <w:r>
+        <w:t xml:space="preserve"> Uses the system for daily operations to coordinate travelers, update branch-specific records, and manage logistical data. </w:t>
+      </w:r>
+      <w:r>
+        <w:rPr>
+          <w:iCs/>
+        </w:rPr>
+        <w:t>Characteristics:</w:t>
+      </w:r>
+      <w:r>
+        <w:t xml:space="preserve"> Basic computer and internet navigation skills.</w:t>
+      </w:r>
+    </w:p>
+    <w:p>
+      <w:pPr>
+        <w:pStyle w:val="template"/>
+        <w:numPr>
+          <w:ilvl w:val="0"/>
+          <w:numId w:val="3"/>
+        </w:numPr>
+      </w:pPr>
+      <w:r>
+        <w:rPr>
+          <w:b/>
+          <w:bCs/>
+        </w:rPr>
+        <w:t>Traveler/Customer:</w:t>
+      </w:r>
+      <w:r>
+        <w:t xml:space="preserve"> Uses the frontend interface to view agency offerings, track itineraries, and communicate. </w:t>
+      </w:r>
+      <w:r>
+        <w:rPr>
+          <w:iCs/>
+        </w:rPr>
+        <w:t>Characteristics:</w:t>
+      </w:r>
+      <w:r>
+        <w:t xml:space="preserve"> General public internet user.</w:t>
       </w:r>
     </w:p>
     <w:p>
@@ -3049,7 +3212,7 @@
         <w:pStyle w:val="Heading2"/>
       </w:pPr>
       <w:bookmarkStart w:id="25" w:name="_Toc439994677"/>
-      <w:bookmarkStart w:id="26" w:name="_Toc228476163"/>
+      <w:bookmarkStart w:id="26" w:name="_Toc228688722"/>
       <w:r>
         <w:t>Operating Environment</w:t>
       </w:r>
@@ -3061,7 +3224,65 @@
         <w:pStyle w:val="template"/>
       </w:pPr>
       <w:r>
-        <w:t>&lt;Describe the environment in which the software will operate, including the hardware platform, operating system and versions, and any other software components or applications with which it must peacefully coexist.&gt;</w:t>
+        <w:t>The system will operate in the following environments:</w:t>
+      </w:r>
+    </w:p>
+    <w:p>
+      <w:pPr>
+        <w:pStyle w:val="template"/>
+        <w:numPr>
+          <w:ilvl w:val="0"/>
+          <w:numId w:val="4"/>
+        </w:numPr>
+      </w:pPr>
+      <w:r>
+        <w:rPr>
+          <w:b/>
+          <w:bCs/>
+        </w:rPr>
+        <w:lastRenderedPageBreak/>
+        <w:t>Client-Side:</w:t>
+      </w:r>
+      <w:r>
+        <w:t xml:space="preserve"> Modern web browsers (Google Chrome, Mozilla Firefox, Apple Safari, Microsoft Edge) running on desktop, tablet, or mobile operating systems.</w:t>
+      </w:r>
+    </w:p>
+    <w:p>
+      <w:pPr>
+        <w:pStyle w:val="template"/>
+        <w:numPr>
+          <w:ilvl w:val="0"/>
+          <w:numId w:val="4"/>
+        </w:numPr>
+      </w:pPr>
+      <w:r>
+        <w:rPr>
+          <w:b/>
+          <w:bCs/>
+        </w:rPr>
+        <w:t>Server-Side:</w:t>
+      </w:r>
+      <w:r>
+        <w:t xml:space="preserve"> Node.js runtime environment.</w:t>
+      </w:r>
+    </w:p>
+    <w:p>
+      <w:pPr>
+        <w:pStyle w:val="template"/>
+        <w:numPr>
+          <w:ilvl w:val="0"/>
+          <w:numId w:val="4"/>
+        </w:numPr>
+      </w:pPr>
+      <w:r>
+        <w:rPr>
+          <w:b/>
+          <w:bCs/>
+        </w:rPr>
+        <w:t>Database:</w:t>
+      </w:r>
+      <w:r>
+        <w:t xml:space="preserve"> PostgreSQL relational database.</w:t>
       </w:r>
     </w:p>
     <w:p>
@@ -3069,7 +3290,7 @@
         <w:pStyle w:val="Heading2"/>
       </w:pPr>
       <w:bookmarkStart w:id="27" w:name="_Toc439994678"/>
-      <w:bookmarkStart w:id="28" w:name="_Toc228476164"/>
+      <w:bookmarkStart w:id="28" w:name="_Toc228688723"/>
       <w:r>
         <w:t>Design and Implementation Constraints</w:t>
       </w:r>
@@ -3081,7 +3302,55 @@
         <w:pStyle w:val="template"/>
       </w:pPr>
       <w:r>
-        <w:t>&lt;Describe any items or issues that will limit the options available to the developers. These might include: corporate or regulatory policies; hardware limitations (timing requirements, memory requirements); interfaces to other applications; specific technologies, tools, and databases to be used; parallel operations; language requirements; communications protocols; security considerations; design conventions or programming standards (for example, if the customer’s organization will be responsible for maintaining the delivered software).&gt;</w:t>
+        <w:t>The development of the system is bound by the following constraints:</w:t>
+      </w:r>
+    </w:p>
+    <w:p>
+      <w:pPr>
+        <w:pStyle w:val="template"/>
+        <w:numPr>
+          <w:ilvl w:val="0"/>
+          <w:numId w:val="5"/>
+        </w:numPr>
+      </w:pPr>
+      <w:r>
+        <w:t>The frontend must be implemented using React and styled with CSS.</w:t>
+      </w:r>
+    </w:p>
+    <w:p>
+      <w:pPr>
+        <w:pStyle w:val="template"/>
+        <w:numPr>
+          <w:ilvl w:val="0"/>
+          <w:numId w:val="5"/>
+        </w:numPr>
+      </w:pPr>
+      <w:r>
+        <w:t>The backend application must be built using Node.js and the Express framework.</w:t>
+      </w:r>
+    </w:p>
+    <w:p>
+      <w:pPr>
+        <w:pStyle w:val="template"/>
+        <w:numPr>
+          <w:ilvl w:val="0"/>
+          <w:numId w:val="5"/>
+        </w:numPr>
+      </w:pPr>
+      <w:r>
+        <w:t>System data must be managed using a PostgreSQL database.</w:t>
+      </w:r>
+    </w:p>
+    <w:p>
+      <w:pPr>
+        <w:pStyle w:val="template"/>
+        <w:numPr>
+          <w:ilvl w:val="0"/>
+          <w:numId w:val="5"/>
+        </w:numPr>
+      </w:pPr>
+      <w:r>
+        <w:t>Development must be completed within the specific timeframe allotted for the academic semester project.</w:t>
       </w:r>
     </w:p>
     <w:p>
@@ -3089,7 +3358,7 @@
         <w:pStyle w:val="Heading2"/>
       </w:pPr>
       <w:bookmarkStart w:id="29" w:name="_Toc439994679"/>
-      <w:bookmarkStart w:id="30" w:name="_Toc228476165"/>
+      <w:bookmarkStart w:id="30" w:name="_Toc228688724"/>
       <w:r>
         <w:t>User Documentation</w:t>
       </w:r>
@@ -3101,7 +3370,7 @@
         <w:pStyle w:val="template"/>
       </w:pPr>
       <w:r>
-        <w:t>&lt;List the user documentation components (such as user manuals, on-line help, and tutorials) that will be delivered along with the software. Identify any known user documentation delivery formats or standards.&gt;</w:t>
+        <w:t>A comprehensive technical README file will be provided, detailing environment setup, database configuration, and local deployment instructions for developers and evaluators. For end-users, the user interface is designed to be self-explanatory, utilizing standard web conventions, contextual tooltips, and clear navigation menus to eliminate the need for extensive user manuals.</w:t>
       </w:r>
     </w:p>
     <w:p>
@@ -3109,7 +3378,7 @@
         <w:pStyle w:val="Heading2"/>
       </w:pPr>
       <w:bookmarkStart w:id="31" w:name="_Toc439994680"/>
-      <w:bookmarkStart w:id="32" w:name="_Toc228476166"/>
+      <w:bookmarkStart w:id="32" w:name="_Toc228688725"/>
       <w:r>
         <w:t>Assumptions and Dependencies</w:t>
       </w:r>
@@ -3118,14 +3387,68 @@
     </w:p>
     <w:p>
       <w:pPr>
-        <w:pStyle w:val="template"/>
-      </w:pPr>
-      <w:r>
-        <w:t xml:space="preserve">&lt;List any assumed factors (as opposed to known facts) that could affect the requirements stated in the SRS. These could include third-party or commercial components that you plan to use, issues around the development or operating environment, or constraints. The project could be affected if these assumptions are incorrect, are not shared, or change. Also identify any dependencies the project has on external factors, such as software components that you intend to reuse from </w:t>
-      </w:r>
-      <w:r>
-        <w:lastRenderedPageBreak/>
-        <w:t>another project, unless they are already documented elsewhere (for example, in the vision and scope document or the project plan).&gt;</w:t>
+        <w:pStyle w:val="NormalWeb"/>
+      </w:pPr>
+      <w:proofErr w:type="gramStart"/>
+      <w:r>
+        <w:rPr>
+          <w:rFonts w:hAnsi="Symbol"/>
+        </w:rPr>
+        <w:t></w:t>
+      </w:r>
+      <w:r>
+        <w:t xml:space="preserve">  </w:t>
+      </w:r>
+      <w:r>
+        <w:rPr>
+          <w:b/>
+          <w:bCs/>
+        </w:rPr>
+        <w:t>Assumptions</w:t>
+      </w:r>
+      <w:proofErr w:type="gramEnd"/>
+      <w:r>
+        <w:rPr>
+          <w:b/>
+          <w:bCs/>
+        </w:rPr>
+        <w:t>:</w:t>
+      </w:r>
+      <w:r>
+        <w:t xml:space="preserve"> It is assumed that all users will access the system via a device with a stable internet connection and a modern web browser with JavaScript enabled.</w:t>
+      </w:r>
+    </w:p>
+    <w:p>
+      <w:pPr>
+        <w:pStyle w:val="NormalWeb"/>
+      </w:pPr>
+      <w:proofErr w:type="gramStart"/>
+      <w:r>
+        <w:rPr>
+          <w:rFonts w:hAnsi="Symbol"/>
+        </w:rPr>
+        <w:t></w:t>
+      </w:r>
+      <w:r>
+        <w:t xml:space="preserve">  </w:t>
+      </w:r>
+      <w:r>
+        <w:rPr>
+          <w:b/>
+          <w:bCs/>
+        </w:rPr>
+        <w:t>Dependencies</w:t>
+      </w:r>
+      <w:proofErr w:type="gramEnd"/>
+      <w:r>
+        <w:rPr>
+          <w:b/>
+          <w:bCs/>
+        </w:rPr>
+        <w:t>:</w:t>
+      </w:r>
+      <w:r>
+        <w:t xml:space="preserve"> The system relies on continuous support for the open-source technologies used in the PERN stack. It also depends on third-party cloud hosting services for database hosting and frontend deployment, as well as various Node Package Manager (NPM) libraries for core functionalities.</w:t>
       </w:r>
     </w:p>
     <w:p>
@@ -3133,7 +3456,7 @@
         <w:pStyle w:val="Heading1"/>
       </w:pPr>
       <w:bookmarkStart w:id="33" w:name="_Toc439994682"/>
-      <w:bookmarkStart w:id="34" w:name="_Toc228476167"/>
+      <w:bookmarkStart w:id="34" w:name="_Toc228688726"/>
       <w:r>
         <w:t>External Interface Requirements</w:t>
       </w:r>
@@ -3144,7 +3467,7 @@
       <w:pPr>
         <w:pStyle w:val="Heading2"/>
       </w:pPr>
-      <w:bookmarkStart w:id="35" w:name="_Toc228476168"/>
+      <w:bookmarkStart w:id="35" w:name="_Toc228688727"/>
       <w:r>
         <w:t>User Interfaces</w:t>
       </w:r>
@@ -3155,15 +3478,308 @@
         <w:pStyle w:val="template"/>
       </w:pPr>
       <w:r>
-        <w:t>&lt;Describe the logical characteristics of each interface between the software product and the users. This may include sample screen images, any GUI standards or product family style guides that are to be followed, screen layout constraints, standard buttons and functions (e.g., help) that will appear on every screen, keyboard shortcuts, error message display standards, and so on. Define the software components for which a user interface is needed. Details of the user interface design should be documented in a separate user interface specification.&gt;</w:t>
-      </w:r>
+        <w:t xml:space="preserve">The user interface of </w:t>
+      </w:r>
+      <w:proofErr w:type="spellStart"/>
+      <w:r>
+        <w:t>Pothik</w:t>
+      </w:r>
+      <w:proofErr w:type="spellEnd"/>
+      <w:r>
+        <w:t xml:space="preserve"> </w:t>
+      </w:r>
+      <w:proofErr w:type="spellStart"/>
+      <w:r>
+        <w:t>Bondhu</w:t>
+      </w:r>
+      <w:proofErr w:type="spellEnd"/>
+      <w:r>
+        <w:t xml:space="preserve"> is designed to be responsive, intuitive, and accessible across various devices. It is built using React.js and styled with Tailwind CSS to ensure a modern, clean aesthetic.</w:t>
+      </w:r>
+    </w:p>
+    <w:p>
+      <w:pPr>
+        <w:pStyle w:val="template"/>
+      </w:pPr>
+    </w:p>
+    <w:p>
+      <w:pPr>
+        <w:pStyle w:val="template"/>
+      </w:pPr>
+    </w:p>
+    <w:p>
+      <w:pPr>
+        <w:pStyle w:val="template"/>
+      </w:pPr>
+    </w:p>
+    <w:p>
+      <w:pPr>
+        <w:pStyle w:val="template"/>
+      </w:pPr>
+    </w:p>
+    <w:p>
+      <w:pPr>
+        <w:pStyle w:val="template"/>
+      </w:pPr>
+    </w:p>
+    <w:p>
+      <w:pPr>
+        <w:pStyle w:val="template"/>
+      </w:pPr>
+    </w:p>
+    <w:p>
+      <w:pPr>
+        <w:pStyle w:val="template"/>
+      </w:pPr>
+    </w:p>
+    <w:p>
+      <w:pPr>
+        <w:pStyle w:val="template"/>
+      </w:pPr>
+    </w:p>
+    <w:p>
+      <w:pPr>
+        <w:pStyle w:val="template"/>
+      </w:pPr>
+      <w:r>
+        <w:lastRenderedPageBreak/>
+        <w:drawing>
+          <wp:anchor distT="0" distB="0" distL="114300" distR="114300" simplePos="0" relativeHeight="251659264" behindDoc="0" locked="0" layoutInCell="1" allowOverlap="1" wp14:anchorId="4B43358B" wp14:editId="270A9C48">
+            <wp:simplePos x="0" y="0"/>
+            <wp:positionH relativeFrom="margin">
+              <wp:posOffset>354330</wp:posOffset>
+            </wp:positionH>
+            <wp:positionV relativeFrom="margin">
+              <wp:posOffset>3324860</wp:posOffset>
+            </wp:positionV>
+            <wp:extent cx="5278120" cy="2412365"/>
+            <wp:effectExtent l="0" t="0" r="0" b="6985"/>
+            <wp:wrapSquare wrapText="bothSides"/>
+            <wp:docPr id="913234009" name="Picture 1"/>
+            <wp:cNvGraphicFramePr>
+              <a:graphicFrameLocks xmlns:a="http://schemas.openxmlformats.org/drawingml/2006/main" noChangeAspect="1"/>
+            </wp:cNvGraphicFramePr>
+            <a:graphic xmlns:a="http://schemas.openxmlformats.org/drawingml/2006/main">
+              <a:graphicData uri="http://schemas.openxmlformats.org/drawingml/2006/picture">
+                <pic:pic xmlns:pic="http://schemas.openxmlformats.org/drawingml/2006/picture">
+                  <pic:nvPicPr>
+                    <pic:cNvPr id="913234009" name=""/>
+                    <pic:cNvPicPr/>
+                  </pic:nvPicPr>
+                  <pic:blipFill>
+                    <a:blip r:embed="rId11" cstate="print">
+                      <a:extLst>
+                        <a:ext uri="{28A0092B-C50C-407E-A947-70E740481C1C}">
+                          <a14:useLocalDpi xmlns:a14="http://schemas.microsoft.com/office/drawing/2010/main" val="0"/>
+                        </a:ext>
+                      </a:extLst>
+                    </a:blip>
+                    <a:stretch>
+                      <a:fillRect/>
+                    </a:stretch>
+                  </pic:blipFill>
+                  <pic:spPr>
+                    <a:xfrm>
+                      <a:off x="0" y="0"/>
+                      <a:ext cx="5278120" cy="2412365"/>
+                    </a:xfrm>
+                    <a:prstGeom prst="rect">
+                      <a:avLst/>
+                    </a:prstGeom>
+                  </pic:spPr>
+                </pic:pic>
+              </a:graphicData>
+            </a:graphic>
+            <wp14:sizeRelH relativeFrom="margin">
+              <wp14:pctWidth>0</wp14:pctWidth>
+            </wp14:sizeRelH>
+            <wp14:sizeRelV relativeFrom="margin">
+              <wp14:pctHeight>0</wp14:pctHeight>
+            </wp14:sizeRelV>
+          </wp:anchor>
+        </w:drawing>
+      </w:r>
+      <w:r>
+        <w:drawing>
+          <wp:anchor distT="0" distB="0" distL="114300" distR="114300" simplePos="0" relativeHeight="251660288" behindDoc="0" locked="0" layoutInCell="1" allowOverlap="1" wp14:anchorId="62347C31" wp14:editId="541E3CAD">
+            <wp:simplePos x="0" y="0"/>
+            <wp:positionH relativeFrom="margin">
+              <wp:posOffset>226060</wp:posOffset>
+            </wp:positionH>
+            <wp:positionV relativeFrom="margin">
+              <wp:posOffset>474345</wp:posOffset>
+            </wp:positionV>
+            <wp:extent cx="5480050" cy="2693670"/>
+            <wp:effectExtent l="0" t="0" r="6350" b="0"/>
+            <wp:wrapSquare wrapText="bothSides"/>
+            <wp:docPr id="1345836485" name="Picture 1"/>
+            <wp:cNvGraphicFramePr>
+              <a:graphicFrameLocks xmlns:a="http://schemas.openxmlformats.org/drawingml/2006/main" noChangeAspect="1"/>
+            </wp:cNvGraphicFramePr>
+            <a:graphic xmlns:a="http://schemas.openxmlformats.org/drawingml/2006/main">
+              <a:graphicData uri="http://schemas.openxmlformats.org/drawingml/2006/picture">
+                <pic:pic xmlns:pic="http://schemas.openxmlformats.org/drawingml/2006/picture">
+                  <pic:nvPicPr>
+                    <pic:cNvPr id="1345836485" name=""/>
+                    <pic:cNvPicPr/>
+                  </pic:nvPicPr>
+                  <pic:blipFill>
+                    <a:blip r:embed="rId12" cstate="print">
+                      <a:extLst>
+                        <a:ext uri="{28A0092B-C50C-407E-A947-70E740481C1C}">
+                          <a14:useLocalDpi xmlns:a14="http://schemas.microsoft.com/office/drawing/2010/main" val="0"/>
+                        </a:ext>
+                      </a:extLst>
+                    </a:blip>
+                    <a:stretch>
+                      <a:fillRect/>
+                    </a:stretch>
+                  </pic:blipFill>
+                  <pic:spPr>
+                    <a:xfrm>
+                      <a:off x="0" y="0"/>
+                      <a:ext cx="5480050" cy="2693670"/>
+                    </a:xfrm>
+                    <a:prstGeom prst="rect">
+                      <a:avLst/>
+                    </a:prstGeom>
+                  </pic:spPr>
+                </pic:pic>
+              </a:graphicData>
+            </a:graphic>
+            <wp14:sizeRelH relativeFrom="margin">
+              <wp14:pctWidth>0</wp14:pctWidth>
+            </wp14:sizeRelH>
+            <wp14:sizeRelV relativeFrom="margin">
+              <wp14:pctHeight>0</wp14:pctHeight>
+            </wp14:sizeRelV>
+          </wp:anchor>
+        </w:drawing>
+      </w:r>
+    </w:p>
+    <w:p>
+      <w:pPr>
+        <w:pStyle w:val="template"/>
+        <w:spacing w:line="240" w:lineRule="auto"/>
+      </w:pPr>
+      <w:r>
+        <w:drawing>
+          <wp:inline distT="0" distB="0" distL="0" distR="0" wp14:anchorId="3F41FE1A" wp14:editId="6A93FFAD">
+            <wp:extent cx="5604164" cy="2147570"/>
+            <wp:effectExtent l="0" t="0" r="0" b="5080"/>
+            <wp:docPr id="1678190616" name="Picture 1"/>
+            <wp:cNvGraphicFramePr>
+              <a:graphicFrameLocks xmlns:a="http://schemas.openxmlformats.org/drawingml/2006/main" noChangeAspect="1"/>
+            </wp:cNvGraphicFramePr>
+            <a:graphic xmlns:a="http://schemas.openxmlformats.org/drawingml/2006/main">
+              <a:graphicData uri="http://schemas.openxmlformats.org/drawingml/2006/picture">
+                <pic:pic xmlns:pic="http://schemas.openxmlformats.org/drawingml/2006/picture">
+                  <pic:nvPicPr>
+                    <pic:cNvPr id="1678190616" name=""/>
+                    <pic:cNvPicPr/>
+                  </pic:nvPicPr>
+                  <pic:blipFill>
+                    <a:blip r:embed="rId13"/>
+                    <a:stretch>
+                      <a:fillRect/>
+                    </a:stretch>
+                  </pic:blipFill>
+                  <pic:spPr>
+                    <a:xfrm>
+                      <a:off x="0" y="0"/>
+                      <a:ext cx="5616432" cy="2152271"/>
+                    </a:xfrm>
+                    <a:prstGeom prst="rect">
+                      <a:avLst/>
+                    </a:prstGeom>
+                  </pic:spPr>
+                </pic:pic>
+              </a:graphicData>
+            </a:graphic>
+          </wp:inline>
+        </w:drawing>
+      </w:r>
+    </w:p>
+    <w:p>
+      <w:pPr>
+        <w:pStyle w:val="template"/>
+      </w:pPr>
+    </w:p>
+    <w:p>
+      <w:pPr>
+        <w:pStyle w:val="template"/>
+      </w:pPr>
+    </w:p>
+    <w:p>
+      <w:pPr>
+        <w:pStyle w:val="template"/>
+        <w:spacing w:line="240" w:lineRule="auto"/>
+      </w:pPr>
+      <w:r>
+        <w:lastRenderedPageBreak/>
+        <w:drawing>
+          <wp:inline distT="0" distB="0" distL="0" distR="0" wp14:anchorId="057046D5" wp14:editId="1B5BF50F">
+            <wp:extent cx="5784273" cy="3690474"/>
+            <wp:effectExtent l="0" t="0" r="6985" b="5715"/>
+            <wp:docPr id="1521156336" name="Picture 1"/>
+            <wp:cNvGraphicFramePr>
+              <a:graphicFrameLocks xmlns:a="http://schemas.openxmlformats.org/drawingml/2006/main" noChangeAspect="1"/>
+            </wp:cNvGraphicFramePr>
+            <a:graphic xmlns:a="http://schemas.openxmlformats.org/drawingml/2006/main">
+              <a:graphicData uri="http://schemas.openxmlformats.org/drawingml/2006/picture">
+                <pic:pic xmlns:pic="http://schemas.openxmlformats.org/drawingml/2006/picture">
+                  <pic:nvPicPr>
+                    <pic:cNvPr id="1521156336" name=""/>
+                    <pic:cNvPicPr/>
+                  </pic:nvPicPr>
+                  <pic:blipFill>
+                    <a:blip r:embed="rId14"/>
+                    <a:stretch>
+                      <a:fillRect/>
+                    </a:stretch>
+                  </pic:blipFill>
+                  <pic:spPr>
+                    <a:xfrm>
+                      <a:off x="0" y="0"/>
+                      <a:ext cx="5801770" cy="3701637"/>
+                    </a:xfrm>
+                    <a:prstGeom prst="rect">
+                      <a:avLst/>
+                    </a:prstGeom>
+                  </pic:spPr>
+                </pic:pic>
+              </a:graphicData>
+            </a:graphic>
+          </wp:inline>
+        </w:drawing>
+      </w:r>
+    </w:p>
+    <w:p>
+      <w:pPr>
+        <w:pStyle w:val="template"/>
+      </w:pPr>
+    </w:p>
+    <w:p>
+      <w:pPr>
+        <w:pStyle w:val="template"/>
+      </w:pPr>
+    </w:p>
+    <w:p>
+      <w:pPr>
+        <w:pStyle w:val="template"/>
+      </w:pPr>
+    </w:p>
+    <w:p>
+      <w:pPr>
+        <w:pStyle w:val="template"/>
+      </w:pPr>
     </w:p>
     <w:p>
       <w:pPr>
         <w:pStyle w:val="Heading2"/>
       </w:pPr>
       <w:bookmarkStart w:id="36" w:name="_Toc439994684"/>
-      <w:bookmarkStart w:id="37" w:name="_Toc228476169"/>
+      <w:bookmarkStart w:id="37" w:name="_Toc228688728"/>
       <w:r>
         <w:t>Hardware Interfaces</w:t>
       </w:r>
@@ -3175,7 +3791,61 @@
         <w:pStyle w:val="template"/>
       </w:pPr>
       <w:r>
-        <w:t>&lt;Describe the logical and physical characteristics of each interface between the software product and the hardware components of the system. This may include the supported device types, the nature of the data and control interactions between the software and the hardware, and communication protocols to be used.&gt;</w:t>
+        <w:t xml:space="preserve">As a web-based application, </w:t>
+      </w:r>
+      <w:proofErr w:type="spellStart"/>
+      <w:r>
+        <w:t>Pothik</w:t>
+      </w:r>
+      <w:proofErr w:type="spellEnd"/>
+      <w:r>
+        <w:t xml:space="preserve"> </w:t>
+      </w:r>
+      <w:proofErr w:type="spellStart"/>
+      <w:r>
+        <w:t>Bondhu</w:t>
+      </w:r>
+      <w:proofErr w:type="spellEnd"/>
+      <w:r>
+        <w:t xml:space="preserve"> does not require any specialized hardware interfaces (such as barcode scanners or custom sensors).</w:t>
+      </w:r>
+    </w:p>
+    <w:p>
+      <w:pPr>
+        <w:pStyle w:val="template"/>
+        <w:numPr>
+          <w:ilvl w:val="0"/>
+          <w:numId w:val="6"/>
+        </w:numPr>
+      </w:pPr>
+      <w:r>
+        <w:rPr>
+          <w:b/>
+          <w:bCs/>
+        </w:rPr>
+        <w:t>Client Devices:</w:t>
+      </w:r>
+      <w:r>
+        <w:t xml:space="preserve"> The system interfaces with standard consumer hardware, including desktop computers, laptops, tablets, and smartphones.</w:t>
+      </w:r>
+    </w:p>
+    <w:p>
+      <w:pPr>
+        <w:pStyle w:val="template"/>
+        <w:numPr>
+          <w:ilvl w:val="0"/>
+          <w:numId w:val="6"/>
+        </w:numPr>
+      </w:pPr>
+      <w:r>
+        <w:rPr>
+          <w:b/>
+          <w:bCs/>
+        </w:rPr>
+        <w:t>Server Hardware:</w:t>
+      </w:r>
+      <w:r>
+        <w:t xml:space="preserve"> The application will run on standard cloud-based server hardware capable of hosting Node.js applications and PostgreSQL databases.</w:t>
       </w:r>
     </w:p>
     <w:p>
@@ -3183,7 +3853,7 @@
         <w:pStyle w:val="Heading2"/>
       </w:pPr>
       <w:bookmarkStart w:id="38" w:name="_Toc439994685"/>
-      <w:bookmarkStart w:id="39" w:name="_Toc228476170"/>
+      <w:bookmarkStart w:id="39" w:name="_Toc228688729"/>
       <w:r>
         <w:t>Software Interfaces</w:t>
       </w:r>
@@ -3195,7 +3865,74 @@
         <w:pStyle w:val="template"/>
       </w:pPr>
       <w:r>
-        <w:t>&lt;Describe the connections between this product and other specific software components (name and version), including databases, operating systems, tools, libraries, and integrated commercial components. Identify the data items or messages coming into the system and going out and describe the purpose of each. Describe the services needed and the nature of communications. Refer to documents that describe detailed application programming interface protocols. Identify data that will be shared across software components. If the data sharing mechanism must be implemented in a specific way (for example, use of a global data area in a multitasking operating system), specify this as an implementation constraint.&gt;</w:t>
+        <w:t>The system relies on the following software components to function:</w:t>
+      </w:r>
+    </w:p>
+    <w:p>
+      <w:pPr>
+        <w:pStyle w:val="template"/>
+        <w:numPr>
+          <w:ilvl w:val="0"/>
+          <w:numId w:val="7"/>
+        </w:numPr>
+      </w:pPr>
+      <w:r>
+        <w:rPr>
+          <w:b/>
+          <w:bCs/>
+        </w:rPr>
+        <w:t>Operating Systems:</w:t>
+      </w:r>
+      <w:r>
+        <w:t xml:space="preserve"> The client application is OS-agnostic and runs within standard web browsers. The backend server will be hosted on a Linux or Windows-based cloud server.</w:t>
+      </w:r>
+    </w:p>
+    <w:p>
+      <w:pPr>
+        <w:pStyle w:val="template"/>
+        <w:numPr>
+          <w:ilvl w:val="0"/>
+          <w:numId w:val="7"/>
+        </w:numPr>
+      </w:pPr>
+      <w:r>
+        <w:rPr>
+          <w:b/>
+          <w:bCs/>
+        </w:rPr>
+        <w:t>Database:</w:t>
+      </w:r>
+      <w:r>
+        <w:t xml:space="preserve"> The system interfaces with a </w:t>
+      </w:r>
+      <w:r>
+        <w:rPr>
+          <w:b/>
+          <w:bCs/>
+        </w:rPr>
+        <w:t>PostgreSQL</w:t>
+      </w:r>
+      <w:r>
+        <w:t xml:space="preserve"> database to store, retrieve, and update user profiles, agency records, and booking data.</w:t>
+      </w:r>
+    </w:p>
+    <w:p>
+      <w:pPr>
+        <w:pStyle w:val="template"/>
+        <w:numPr>
+          <w:ilvl w:val="0"/>
+          <w:numId w:val="7"/>
+        </w:numPr>
+      </w:pPr>
+      <w:r>
+        <w:rPr>
+          <w:b/>
+          <w:bCs/>
+        </w:rPr>
+        <w:t>Application Programming Interface (API):</w:t>
+      </w:r>
+      <w:r>
+        <w:t xml:space="preserve"> The React frontend communicates with the Node.js/Express.js backend via a custom-built RESTful API, exchanging data in JSON format.</w:t>
       </w:r>
     </w:p>
     <w:p>
@@ -3203,8 +3940,9 @@
         <w:pStyle w:val="Heading2"/>
       </w:pPr>
       <w:bookmarkStart w:id="40" w:name="_Toc439994686"/>
-      <w:bookmarkStart w:id="41" w:name="_Toc228476171"/>
-      <w:r>
+      <w:bookmarkStart w:id="41" w:name="_Toc228688730"/>
+      <w:r>
+        <w:lastRenderedPageBreak/>
         <w:t>Communications Interfaces</w:t>
       </w:r>
       <w:bookmarkEnd w:id="40"/>
@@ -3214,8 +3952,32 @@
       <w:pPr>
         <w:pStyle w:val="template"/>
       </w:pPr>
-      <w:r>
-        <w:t>&lt;Describe the requirements associated with any communications functions required by this product, including e-mail, web browser, network server communications protocols, electronic forms, and so on. Define any pertinent message formatting. Identify any communication standards that will be used, such as FTP or HTTP. Specify any communication security or encryption issues, data transfer rates, and synchronization mechanisms.&gt;</w:t>
+      <w:proofErr w:type="spellStart"/>
+      <w:r>
+        <w:t>Pothik</w:t>
+      </w:r>
+      <w:proofErr w:type="spellEnd"/>
+      <w:r>
+        <w:t xml:space="preserve"> Bondhu utilizes standard internet protocols to ensure secure and efficient data transfer:</w:t>
+      </w:r>
+    </w:p>
+    <w:p>
+      <w:pPr>
+        <w:pStyle w:val="template"/>
+        <w:numPr>
+          <w:ilvl w:val="0"/>
+          <w:numId w:val="8"/>
+        </w:numPr>
+      </w:pPr>
+      <w:r>
+        <w:rPr>
+          <w:b/>
+          <w:bCs/>
+        </w:rPr>
+        <w:t>HTTP/HTTPS:</w:t>
+      </w:r>
+      <w:r>
+        <w:t xml:space="preserve"> Standard web protocols are used for all REST API requests between the client browser and the server.</w:t>
       </w:r>
     </w:p>
     <w:p>
@@ -3223,7 +3985,7 @@
         <w:pStyle w:val="Heading1"/>
       </w:pPr>
       <w:bookmarkStart w:id="42" w:name="_Toc439994687"/>
-      <w:bookmarkStart w:id="43" w:name="_Toc228476172"/>
+      <w:bookmarkStart w:id="43" w:name="_Toc228688731"/>
       <w:r>
         <w:t>System Features</w:t>
       </w:r>
@@ -3235,7 +3997,13 @@
         <w:pStyle w:val="template"/>
       </w:pPr>
       <w:r>
-        <w:t>&lt;This template illustrates organizing the functional requirements for the product by system features, the major services provided by the product. You may prefer to organize this section by use case, mode of operation, user class, object class, functional hierarchy, or combinations of these, whatever makes the most logical sense for your product.&gt;</w:t>
+        <w:t>&lt;</w:t>
+      </w:r>
+      <w:r>
+        <w:t xml:space="preserve"> </w:t>
+      </w:r>
+      <w:r>
+        <w:t>&gt;</w:t>
       </w:r>
     </w:p>
     <w:p>
@@ -3243,9 +4011,8 @@
         <w:pStyle w:val="Heading2"/>
       </w:pPr>
       <w:bookmarkStart w:id="44" w:name="_Toc439994688"/>
-      <w:bookmarkStart w:id="45" w:name="_Toc228476173"/>
-      <w:r>
-        <w:lastRenderedPageBreak/>
+      <w:bookmarkStart w:id="45" w:name="_Toc228688732"/>
+      <w:r>
         <w:t>System Feature 1</w:t>
       </w:r>
       <w:bookmarkEnd w:id="44"/>
@@ -3256,7 +4023,7 @@
         <w:pStyle w:val="template"/>
       </w:pPr>
       <w:r>
-        <w:t>&lt;Don’t really say “System Feature 1.” State the feature name in just a few words.&gt;</w:t>
+        <w:t>&lt;&gt;</w:t>
       </w:r>
     </w:p>
     <w:p>
@@ -3281,7 +4048,7 @@
         <w:ind w:left="1350" w:hanging="716"/>
       </w:pPr>
       <w:r>
-        <w:t>&lt;Provide a short description of the feature and indicate whether it is of High, Medium, or Low priority. You could also include specific priority component ratings, such as benefit, penalty, cost, and risk (each rated on a relative scale from a low of 1 to a high of 9).&gt;</w:t>
+        <w:t>&lt;&gt;</w:t>
       </w:r>
     </w:p>
     <w:p>
@@ -3306,7 +4073,7 @@
         <w:ind w:left="1350" w:hanging="716"/>
       </w:pPr>
       <w:r>
-        <w:t>&lt;List the sequences of user actions and system responses that stimulate the behavior defined for this feature. These will correspond to the dialog elements associated with use cases.&gt;</w:t>
+        <w:t>&lt;&gt;</w:t>
       </w:r>
     </w:p>
     <w:p>
@@ -3334,15 +4101,7 @@
         </w:rPr>
       </w:pPr>
       <w:r>
-        <w:t xml:space="preserve">&lt;Itemize the detailed functional requirements associated with this feature. These are the software capabilities that must be present in order for the user to carry out the services provided by the feature, or to execute the use case. Include how the product should respond to anticipated error conditions or invalid inputs. Requirements should be concise, complete, unambiguous, verifiable, and necessary. Use “TBD” as a placeholder to indicate when </w:t>
-      </w:r>
-      <w:proofErr w:type="gramStart"/>
-      <w:r>
-        <w:t>necessary</w:t>
-      </w:r>
-      <w:proofErr w:type="gramEnd"/>
-      <w:r>
-        <w:t xml:space="preserve"> information is not yet available.&gt;</w:t>
+        <w:t>&lt;&gt;</w:t>
       </w:r>
     </w:p>
     <w:p>
@@ -3365,7 +4124,13 @@
         <w:ind w:left="1350" w:hanging="716"/>
       </w:pPr>
       <w:r>
-        <w:t>&lt;Each requirement should be uniquely identified with a sequence number or a meaningful tag of some kind.&gt;</w:t>
+        <w:t>&lt;</w:t>
+      </w:r>
+      <w:r>
+        <w:t xml:space="preserve"> </w:t>
+      </w:r>
+      <w:r>
+        <w:t>&gt;</w:t>
       </w:r>
     </w:p>
     <w:p>
@@ -3408,7 +4173,7 @@
         <w:pStyle w:val="Heading2"/>
       </w:pPr>
       <w:bookmarkStart w:id="46" w:name="_Toc439994689"/>
-      <w:bookmarkStart w:id="47" w:name="_Toc228476174"/>
+      <w:bookmarkStart w:id="47" w:name="_Toc228688733"/>
       <w:r>
         <w:t>System Feature 2 (and so on)</w:t>
       </w:r>
@@ -3420,7 +4185,7 @@
         <w:pStyle w:val="Heading1"/>
       </w:pPr>
       <w:bookmarkStart w:id="48" w:name="_Toc439994690"/>
-      <w:bookmarkStart w:id="49" w:name="_Toc228476175"/>
+      <w:bookmarkStart w:id="49" w:name="_Toc228688734"/>
       <w:r>
         <w:t>Other Nonfunctional Requirements</w:t>
       </w:r>
@@ -3430,7 +4195,7 @@
       <w:pPr>
         <w:pStyle w:val="Heading2"/>
       </w:pPr>
-      <w:bookmarkStart w:id="50" w:name="_Toc228476176"/>
+      <w:bookmarkStart w:id="50" w:name="_Toc228688735"/>
       <w:r>
         <w:t>Performance Requirements</w:t>
       </w:r>
@@ -3442,7 +4207,7 @@
         <w:pStyle w:val="template"/>
       </w:pPr>
       <w:r>
-        <w:t>&lt;If there are performance requirements for the product under various circumstances, state them here and explain their rationale, to help the developers understand the intent and make suitable design choices. Specify the timing relationships for real time systems. Make such requirements as specific as possible. You may need to state performance requirements for individual functional requirements or features.&gt;</w:t>
+        <w:t>&lt;&gt;</w:t>
       </w:r>
     </w:p>
     <w:p>
@@ -3450,7 +4215,7 @@
         <w:pStyle w:val="Heading2"/>
       </w:pPr>
       <w:bookmarkStart w:id="51" w:name="_Toc439994691"/>
-      <w:bookmarkStart w:id="52" w:name="_Toc228476177"/>
+      <w:bookmarkStart w:id="52" w:name="_Toc228688736"/>
       <w:r>
         <w:t>Safety Requirements</w:t>
       </w:r>
@@ -3462,7 +4227,7 @@
         <w:pStyle w:val="template"/>
       </w:pPr>
       <w:r>
-        <w:t>&lt;Specify those requirements that are concerned with possible loss, damage, or harm that could result from the use of the product. Define any safeguards or actions that must be taken, as well as actions that must be prevented. Refer to any external policies or regulations that state safety issues that affect the product’s design or use. Define any safety certifications that must be satisfied.&gt;</w:t>
+        <w:t>&lt;&gt;</w:t>
       </w:r>
     </w:p>
     <w:p>
@@ -3470,9 +4235,8 @@
         <w:pStyle w:val="Heading2"/>
       </w:pPr>
       <w:bookmarkStart w:id="53" w:name="_Toc439994692"/>
-      <w:bookmarkStart w:id="54" w:name="_Toc228476178"/>
-      <w:r>
-        <w:lastRenderedPageBreak/>
+      <w:bookmarkStart w:id="54" w:name="_Toc228688737"/>
+      <w:r>
         <w:t>Security Requirements</w:t>
       </w:r>
       <w:bookmarkEnd w:id="53"/>
@@ -3483,7 +4247,7 @@
         <w:pStyle w:val="template"/>
       </w:pPr>
       <w:r>
-        <w:t>&lt;Specify any requirements regarding security or privacy issues surrounding use of the product or protection of the data used or created by the product. Define any user identity authentication requirements. Refer to any external policies or regulations containing security issues that affect the product. Define any security or privacy certifications that must be satisfied.&gt;</w:t>
+        <w:t>&lt;&gt;</w:t>
       </w:r>
     </w:p>
     <w:p>
@@ -3491,8 +4255,9 @@
         <w:pStyle w:val="Heading2"/>
       </w:pPr>
       <w:bookmarkStart w:id="55" w:name="_Toc439994693"/>
-      <w:bookmarkStart w:id="56" w:name="_Toc228476179"/>
-      <w:r>
+      <w:bookmarkStart w:id="56" w:name="_Toc228688738"/>
+      <w:r>
+        <w:lastRenderedPageBreak/>
         <w:t>Software Quality Attributes</w:t>
       </w:r>
       <w:bookmarkEnd w:id="55"/>
@@ -3503,7 +4268,7 @@
         <w:pStyle w:val="template"/>
       </w:pPr>
       <w:r>
-        <w:t>&lt;Specify any additional quality characteristics for the product that will be important to either the customers or the developers. Some to consider are: adaptability, availability, correctness, flexibility, interoperability, maintainability, portability, reliability, reusability, robustness, testability, and usability. Write these to be specific, quantitative, and verifiable when possible. At the least, clarify the relative preferences for various attributes, such as ease of use over ease of learning.&gt;</w:t>
+        <w:t>&lt;&gt;</w:t>
       </w:r>
     </w:p>
     <w:p>
@@ -3511,7 +4276,7 @@
         <w:pStyle w:val="Heading2"/>
       </w:pPr>
       <w:bookmarkStart w:id="57" w:name="_Toc439994694"/>
-      <w:bookmarkStart w:id="58" w:name="_Toc228476180"/>
+      <w:bookmarkStart w:id="58" w:name="_Toc228688739"/>
       <w:r>
         <w:t>Business Rules</w:t>
       </w:r>
@@ -3523,7 +4288,7 @@
         <w:pStyle w:val="template"/>
       </w:pPr>
       <w:r>
-        <w:t>&lt;List any operating principles about the product, such as which individuals or roles can perform which functions under specific circumstances. These are not functional requirements in themselves, but they may imply certain functional requirements to enforce the rules.&gt;</w:t>
+        <w:t>&lt;&gt;</w:t>
       </w:r>
     </w:p>
     <w:p>
@@ -3531,7 +4296,7 @@
         <w:pStyle w:val="Heading1"/>
       </w:pPr>
       <w:bookmarkStart w:id="59" w:name="_Toc439994695"/>
-      <w:bookmarkStart w:id="60" w:name="_Toc228476181"/>
+      <w:bookmarkStart w:id="60" w:name="_Toc228688740"/>
       <w:r>
         <w:t>Other Requirements</w:t>
       </w:r>
@@ -3543,7 +4308,7 @@
         <w:pStyle w:val="template"/>
       </w:pPr>
       <w:r>
-        <w:t>&lt;Define any other requirements not covered elsewhere in the SRS. This might include database requirements, internationalization requirements, legal requirements, reuse objectives for the project, and so on. Add any new sections that are pertinent to the project.&gt;</w:t>
+        <w:t>&lt;&gt;</w:t>
       </w:r>
     </w:p>
     <w:p>
@@ -3551,7 +4316,7 @@
         <w:pStyle w:val="TOCEntry"/>
       </w:pPr>
       <w:bookmarkStart w:id="61" w:name="_Toc439994696"/>
-      <w:bookmarkStart w:id="62" w:name="_Toc228476182"/>
+      <w:bookmarkStart w:id="62" w:name="_Toc228688741"/>
       <w:r>
         <w:t>Appendix A: Glossary</w:t>
       </w:r>
@@ -3563,7 +4328,7 @@
         <w:pStyle w:val="template"/>
       </w:pPr>
       <w:r>
-        <w:t>&lt;Define all the terms necessary to properly interpret the SRS, including acronyms and abbreviations. You may wish to build a separate glossary that spans multiple projects or the entire organization, and just include terms specific to a single project in each SRS.&gt;</w:t>
+        <w:t>&lt;&gt;</w:t>
       </w:r>
     </w:p>
     <w:p>
@@ -3571,7 +4336,7 @@
         <w:pStyle w:val="TOCEntry"/>
       </w:pPr>
       <w:bookmarkStart w:id="63" w:name="_Toc439994697"/>
-      <w:bookmarkStart w:id="64" w:name="_Toc228476183"/>
+      <w:bookmarkStart w:id="64" w:name="_Toc228688742"/>
       <w:r>
         <w:t>Appendix B: Analysis Models</w:t>
       </w:r>
@@ -3586,13 +4351,13 @@
         </w:rPr>
       </w:pPr>
       <w:r>
-        <w:t>&lt;Optionally, include any pertinent analysis models, such as data flow diagrams, class diagrams, state-transition diagrams, or entity-relationship diagrams</w:t>
+        <w:t>&lt;</w:t>
       </w:r>
       <w:r>
         <w:rPr>
           <w:i w:val="0"/>
         </w:rPr>
-        <w:t>.&gt;</w:t>
+        <w:t>&gt;</w:t>
       </w:r>
     </w:p>
     <w:p>
@@ -3600,7 +4365,7 @@
         <w:pStyle w:val="TOCEntry"/>
       </w:pPr>
       <w:bookmarkStart w:id="65" w:name="_Toc439994698"/>
-      <w:bookmarkStart w:id="66" w:name="_Toc228476184"/>
+      <w:bookmarkStart w:id="66" w:name="_Toc228688743"/>
       <w:r>
         <w:t>Appendix C: To Be Determined List</w:t>
       </w:r>
@@ -3612,7 +4377,7 @@
         <w:pStyle w:val="template"/>
       </w:pPr>
       <w:r>
-        <w:t>&lt;Collect a numbered list of the TBD (to be determined) references that remain in the SRS so they can be tracked to closure.&gt;</w:t>
+        <w:t>&lt;&gt;</w:t>
       </w:r>
     </w:p>
     <w:sectPr>
@@ -3838,8 +4603,1072 @@
       <w:lvlJc w:val="left"/>
     </w:lvl>
   </w:abstractNum>
+  <w:abstractNum w:abstractNumId="1" w15:restartNumberingAfterBreak="0">
+    <w:nsid w:val="3DED718E"/>
+    <w:multiLevelType w:val="multilevel"/>
+    <w:tmpl w:val="38DE2CA8"/>
+    <w:lvl w:ilvl="0">
+      <w:start w:val="1"/>
+      <w:numFmt w:val="bullet"/>
+      <w:lvlText w:val=""/>
+      <w:lvlJc w:val="left"/>
+      <w:pPr>
+        <w:tabs>
+          <w:tab w:val="num" w:pos="720"/>
+        </w:tabs>
+        <w:ind w:left="720" w:hanging="360"/>
+      </w:pPr>
+      <w:rPr>
+        <w:rFonts w:ascii="Symbol" w:hAnsi="Symbol" w:hint="default"/>
+        <w:sz w:val="20"/>
+      </w:rPr>
+    </w:lvl>
+    <w:lvl w:ilvl="1" w:tentative="1">
+      <w:start w:val="1"/>
+      <w:numFmt w:val="bullet"/>
+      <w:lvlText w:val="o"/>
+      <w:lvlJc w:val="left"/>
+      <w:pPr>
+        <w:tabs>
+          <w:tab w:val="num" w:pos="1440"/>
+        </w:tabs>
+        <w:ind w:left="1440" w:hanging="360"/>
+      </w:pPr>
+      <w:rPr>
+        <w:rFonts w:ascii="Courier New" w:hAnsi="Courier New" w:hint="default"/>
+        <w:sz w:val="20"/>
+      </w:rPr>
+    </w:lvl>
+    <w:lvl w:ilvl="2" w:tentative="1">
+      <w:start w:val="1"/>
+      <w:numFmt w:val="bullet"/>
+      <w:lvlText w:val=""/>
+      <w:lvlJc w:val="left"/>
+      <w:pPr>
+        <w:tabs>
+          <w:tab w:val="num" w:pos="2160"/>
+        </w:tabs>
+        <w:ind w:left="2160" w:hanging="360"/>
+      </w:pPr>
+      <w:rPr>
+        <w:rFonts w:ascii="Wingdings" w:hAnsi="Wingdings" w:hint="default"/>
+        <w:sz w:val="20"/>
+      </w:rPr>
+    </w:lvl>
+    <w:lvl w:ilvl="3" w:tentative="1">
+      <w:start w:val="1"/>
+      <w:numFmt w:val="bullet"/>
+      <w:lvlText w:val=""/>
+      <w:lvlJc w:val="left"/>
+      <w:pPr>
+        <w:tabs>
+          <w:tab w:val="num" w:pos="2880"/>
+        </w:tabs>
+        <w:ind w:left="2880" w:hanging="360"/>
+      </w:pPr>
+      <w:rPr>
+        <w:rFonts w:ascii="Wingdings" w:hAnsi="Wingdings" w:hint="default"/>
+        <w:sz w:val="20"/>
+      </w:rPr>
+    </w:lvl>
+    <w:lvl w:ilvl="4" w:tentative="1">
+      <w:start w:val="1"/>
+      <w:numFmt w:val="bullet"/>
+      <w:lvlText w:val=""/>
+      <w:lvlJc w:val="left"/>
+      <w:pPr>
+        <w:tabs>
+          <w:tab w:val="num" w:pos="3600"/>
+        </w:tabs>
+        <w:ind w:left="3600" w:hanging="360"/>
+      </w:pPr>
+      <w:rPr>
+        <w:rFonts w:ascii="Wingdings" w:hAnsi="Wingdings" w:hint="default"/>
+        <w:sz w:val="20"/>
+      </w:rPr>
+    </w:lvl>
+    <w:lvl w:ilvl="5" w:tentative="1">
+      <w:start w:val="1"/>
+      <w:numFmt w:val="bullet"/>
+      <w:lvlText w:val=""/>
+      <w:lvlJc w:val="left"/>
+      <w:pPr>
+        <w:tabs>
+          <w:tab w:val="num" w:pos="4320"/>
+        </w:tabs>
+        <w:ind w:left="4320" w:hanging="360"/>
+      </w:pPr>
+      <w:rPr>
+        <w:rFonts w:ascii="Wingdings" w:hAnsi="Wingdings" w:hint="default"/>
+        <w:sz w:val="20"/>
+      </w:rPr>
+    </w:lvl>
+    <w:lvl w:ilvl="6" w:tentative="1">
+      <w:start w:val="1"/>
+      <w:numFmt w:val="bullet"/>
+      <w:lvlText w:val=""/>
+      <w:lvlJc w:val="left"/>
+      <w:pPr>
+        <w:tabs>
+          <w:tab w:val="num" w:pos="5040"/>
+        </w:tabs>
+        <w:ind w:left="5040" w:hanging="360"/>
+      </w:pPr>
+      <w:rPr>
+        <w:rFonts w:ascii="Wingdings" w:hAnsi="Wingdings" w:hint="default"/>
+        <w:sz w:val="20"/>
+      </w:rPr>
+    </w:lvl>
+    <w:lvl w:ilvl="7" w:tentative="1">
+      <w:start w:val="1"/>
+      <w:numFmt w:val="bullet"/>
+      <w:lvlText w:val=""/>
+      <w:lvlJc w:val="left"/>
+      <w:pPr>
+        <w:tabs>
+          <w:tab w:val="num" w:pos="5760"/>
+        </w:tabs>
+        <w:ind w:left="5760" w:hanging="360"/>
+      </w:pPr>
+      <w:rPr>
+        <w:rFonts w:ascii="Wingdings" w:hAnsi="Wingdings" w:hint="default"/>
+        <w:sz w:val="20"/>
+      </w:rPr>
+    </w:lvl>
+    <w:lvl w:ilvl="8" w:tentative="1">
+      <w:start w:val="1"/>
+      <w:numFmt w:val="bullet"/>
+      <w:lvlText w:val=""/>
+      <w:lvlJc w:val="left"/>
+      <w:pPr>
+        <w:tabs>
+          <w:tab w:val="num" w:pos="6480"/>
+        </w:tabs>
+        <w:ind w:left="6480" w:hanging="360"/>
+      </w:pPr>
+      <w:rPr>
+        <w:rFonts w:ascii="Wingdings" w:hAnsi="Wingdings" w:hint="default"/>
+        <w:sz w:val="20"/>
+      </w:rPr>
+    </w:lvl>
+  </w:abstractNum>
+  <w:abstractNum w:abstractNumId="2" w15:restartNumberingAfterBreak="0">
+    <w:nsid w:val="3F316C5A"/>
+    <w:multiLevelType w:val="multilevel"/>
+    <w:tmpl w:val="0366AE1C"/>
+    <w:lvl w:ilvl="0">
+      <w:start w:val="1"/>
+      <w:numFmt w:val="bullet"/>
+      <w:lvlText w:val=""/>
+      <w:lvlJc w:val="left"/>
+      <w:pPr>
+        <w:tabs>
+          <w:tab w:val="num" w:pos="720"/>
+        </w:tabs>
+        <w:ind w:left="720" w:hanging="360"/>
+      </w:pPr>
+      <w:rPr>
+        <w:rFonts w:ascii="Symbol" w:hAnsi="Symbol" w:hint="default"/>
+        <w:sz w:val="20"/>
+      </w:rPr>
+    </w:lvl>
+    <w:lvl w:ilvl="1" w:tentative="1">
+      <w:start w:val="1"/>
+      <w:numFmt w:val="bullet"/>
+      <w:lvlText w:val="o"/>
+      <w:lvlJc w:val="left"/>
+      <w:pPr>
+        <w:tabs>
+          <w:tab w:val="num" w:pos="1440"/>
+        </w:tabs>
+        <w:ind w:left="1440" w:hanging="360"/>
+      </w:pPr>
+      <w:rPr>
+        <w:rFonts w:ascii="Courier New" w:hAnsi="Courier New" w:hint="default"/>
+        <w:sz w:val="20"/>
+      </w:rPr>
+    </w:lvl>
+    <w:lvl w:ilvl="2" w:tentative="1">
+      <w:start w:val="1"/>
+      <w:numFmt w:val="bullet"/>
+      <w:lvlText w:val=""/>
+      <w:lvlJc w:val="left"/>
+      <w:pPr>
+        <w:tabs>
+          <w:tab w:val="num" w:pos="2160"/>
+        </w:tabs>
+        <w:ind w:left="2160" w:hanging="360"/>
+      </w:pPr>
+      <w:rPr>
+        <w:rFonts w:ascii="Wingdings" w:hAnsi="Wingdings" w:hint="default"/>
+        <w:sz w:val="20"/>
+      </w:rPr>
+    </w:lvl>
+    <w:lvl w:ilvl="3" w:tentative="1">
+      <w:start w:val="1"/>
+      <w:numFmt w:val="bullet"/>
+      <w:lvlText w:val=""/>
+      <w:lvlJc w:val="left"/>
+      <w:pPr>
+        <w:tabs>
+          <w:tab w:val="num" w:pos="2880"/>
+        </w:tabs>
+        <w:ind w:left="2880" w:hanging="360"/>
+      </w:pPr>
+      <w:rPr>
+        <w:rFonts w:ascii="Wingdings" w:hAnsi="Wingdings" w:hint="default"/>
+        <w:sz w:val="20"/>
+      </w:rPr>
+    </w:lvl>
+    <w:lvl w:ilvl="4" w:tentative="1">
+      <w:start w:val="1"/>
+      <w:numFmt w:val="bullet"/>
+      <w:lvlText w:val=""/>
+      <w:lvlJc w:val="left"/>
+      <w:pPr>
+        <w:tabs>
+          <w:tab w:val="num" w:pos="3600"/>
+        </w:tabs>
+        <w:ind w:left="3600" w:hanging="360"/>
+      </w:pPr>
+      <w:rPr>
+        <w:rFonts w:ascii="Wingdings" w:hAnsi="Wingdings" w:hint="default"/>
+        <w:sz w:val="20"/>
+      </w:rPr>
+    </w:lvl>
+    <w:lvl w:ilvl="5" w:tentative="1">
+      <w:start w:val="1"/>
+      <w:numFmt w:val="bullet"/>
+      <w:lvlText w:val=""/>
+      <w:lvlJc w:val="left"/>
+      <w:pPr>
+        <w:tabs>
+          <w:tab w:val="num" w:pos="4320"/>
+        </w:tabs>
+        <w:ind w:left="4320" w:hanging="360"/>
+      </w:pPr>
+      <w:rPr>
+        <w:rFonts w:ascii="Wingdings" w:hAnsi="Wingdings" w:hint="default"/>
+        <w:sz w:val="20"/>
+      </w:rPr>
+    </w:lvl>
+    <w:lvl w:ilvl="6" w:tentative="1">
+      <w:start w:val="1"/>
+      <w:numFmt w:val="bullet"/>
+      <w:lvlText w:val=""/>
+      <w:lvlJc w:val="left"/>
+      <w:pPr>
+        <w:tabs>
+          <w:tab w:val="num" w:pos="5040"/>
+        </w:tabs>
+        <w:ind w:left="5040" w:hanging="360"/>
+      </w:pPr>
+      <w:rPr>
+        <w:rFonts w:ascii="Wingdings" w:hAnsi="Wingdings" w:hint="default"/>
+        <w:sz w:val="20"/>
+      </w:rPr>
+    </w:lvl>
+    <w:lvl w:ilvl="7" w:tentative="1">
+      <w:start w:val="1"/>
+      <w:numFmt w:val="bullet"/>
+      <w:lvlText w:val=""/>
+      <w:lvlJc w:val="left"/>
+      <w:pPr>
+        <w:tabs>
+          <w:tab w:val="num" w:pos="5760"/>
+        </w:tabs>
+        <w:ind w:left="5760" w:hanging="360"/>
+      </w:pPr>
+      <w:rPr>
+        <w:rFonts w:ascii="Wingdings" w:hAnsi="Wingdings" w:hint="default"/>
+        <w:sz w:val="20"/>
+      </w:rPr>
+    </w:lvl>
+    <w:lvl w:ilvl="8" w:tentative="1">
+      <w:start w:val="1"/>
+      <w:numFmt w:val="bullet"/>
+      <w:lvlText w:val=""/>
+      <w:lvlJc w:val="left"/>
+      <w:pPr>
+        <w:tabs>
+          <w:tab w:val="num" w:pos="6480"/>
+        </w:tabs>
+        <w:ind w:left="6480" w:hanging="360"/>
+      </w:pPr>
+      <w:rPr>
+        <w:rFonts w:ascii="Wingdings" w:hAnsi="Wingdings" w:hint="default"/>
+        <w:sz w:val="20"/>
+      </w:rPr>
+    </w:lvl>
+  </w:abstractNum>
+  <w:abstractNum w:abstractNumId="3" w15:restartNumberingAfterBreak="0">
+    <w:nsid w:val="41F21CF2"/>
+    <w:multiLevelType w:val="multilevel"/>
+    <w:tmpl w:val="6402F5BC"/>
+    <w:lvl w:ilvl="0">
+      <w:start w:val="1"/>
+      <w:numFmt w:val="bullet"/>
+      <w:lvlText w:val=""/>
+      <w:lvlJc w:val="left"/>
+      <w:pPr>
+        <w:tabs>
+          <w:tab w:val="num" w:pos="720"/>
+        </w:tabs>
+        <w:ind w:left="720" w:hanging="360"/>
+      </w:pPr>
+      <w:rPr>
+        <w:rFonts w:ascii="Symbol" w:hAnsi="Symbol" w:hint="default"/>
+        <w:sz w:val="20"/>
+      </w:rPr>
+    </w:lvl>
+    <w:lvl w:ilvl="1" w:tentative="1">
+      <w:start w:val="1"/>
+      <w:numFmt w:val="bullet"/>
+      <w:lvlText w:val="o"/>
+      <w:lvlJc w:val="left"/>
+      <w:pPr>
+        <w:tabs>
+          <w:tab w:val="num" w:pos="1440"/>
+        </w:tabs>
+        <w:ind w:left="1440" w:hanging="360"/>
+      </w:pPr>
+      <w:rPr>
+        <w:rFonts w:ascii="Courier New" w:hAnsi="Courier New" w:hint="default"/>
+        <w:sz w:val="20"/>
+      </w:rPr>
+    </w:lvl>
+    <w:lvl w:ilvl="2" w:tentative="1">
+      <w:start w:val="1"/>
+      <w:numFmt w:val="bullet"/>
+      <w:lvlText w:val=""/>
+      <w:lvlJc w:val="left"/>
+      <w:pPr>
+        <w:tabs>
+          <w:tab w:val="num" w:pos="2160"/>
+        </w:tabs>
+        <w:ind w:left="2160" w:hanging="360"/>
+      </w:pPr>
+      <w:rPr>
+        <w:rFonts w:ascii="Wingdings" w:hAnsi="Wingdings" w:hint="default"/>
+        <w:sz w:val="20"/>
+      </w:rPr>
+    </w:lvl>
+    <w:lvl w:ilvl="3" w:tentative="1">
+      <w:start w:val="1"/>
+      <w:numFmt w:val="bullet"/>
+      <w:lvlText w:val=""/>
+      <w:lvlJc w:val="left"/>
+      <w:pPr>
+        <w:tabs>
+          <w:tab w:val="num" w:pos="2880"/>
+        </w:tabs>
+        <w:ind w:left="2880" w:hanging="360"/>
+      </w:pPr>
+      <w:rPr>
+        <w:rFonts w:ascii="Wingdings" w:hAnsi="Wingdings" w:hint="default"/>
+        <w:sz w:val="20"/>
+      </w:rPr>
+    </w:lvl>
+    <w:lvl w:ilvl="4" w:tentative="1">
+      <w:start w:val="1"/>
+      <w:numFmt w:val="bullet"/>
+      <w:lvlText w:val=""/>
+      <w:lvlJc w:val="left"/>
+      <w:pPr>
+        <w:tabs>
+          <w:tab w:val="num" w:pos="3600"/>
+        </w:tabs>
+        <w:ind w:left="3600" w:hanging="360"/>
+      </w:pPr>
+      <w:rPr>
+        <w:rFonts w:ascii="Wingdings" w:hAnsi="Wingdings" w:hint="default"/>
+        <w:sz w:val="20"/>
+      </w:rPr>
+    </w:lvl>
+    <w:lvl w:ilvl="5" w:tentative="1">
+      <w:start w:val="1"/>
+      <w:numFmt w:val="bullet"/>
+      <w:lvlText w:val=""/>
+      <w:lvlJc w:val="left"/>
+      <w:pPr>
+        <w:tabs>
+          <w:tab w:val="num" w:pos="4320"/>
+        </w:tabs>
+        <w:ind w:left="4320" w:hanging="360"/>
+      </w:pPr>
+      <w:rPr>
+        <w:rFonts w:ascii="Wingdings" w:hAnsi="Wingdings" w:hint="default"/>
+        <w:sz w:val="20"/>
+      </w:rPr>
+    </w:lvl>
+    <w:lvl w:ilvl="6" w:tentative="1">
+      <w:start w:val="1"/>
+      <w:numFmt w:val="bullet"/>
+      <w:lvlText w:val=""/>
+      <w:lvlJc w:val="left"/>
+      <w:pPr>
+        <w:tabs>
+          <w:tab w:val="num" w:pos="5040"/>
+        </w:tabs>
+        <w:ind w:left="5040" w:hanging="360"/>
+      </w:pPr>
+      <w:rPr>
+        <w:rFonts w:ascii="Wingdings" w:hAnsi="Wingdings" w:hint="default"/>
+        <w:sz w:val="20"/>
+      </w:rPr>
+    </w:lvl>
+    <w:lvl w:ilvl="7" w:tentative="1">
+      <w:start w:val="1"/>
+      <w:numFmt w:val="bullet"/>
+      <w:lvlText w:val=""/>
+      <w:lvlJc w:val="left"/>
+      <w:pPr>
+        <w:tabs>
+          <w:tab w:val="num" w:pos="5760"/>
+        </w:tabs>
+        <w:ind w:left="5760" w:hanging="360"/>
+      </w:pPr>
+      <w:rPr>
+        <w:rFonts w:ascii="Wingdings" w:hAnsi="Wingdings" w:hint="default"/>
+        <w:sz w:val="20"/>
+      </w:rPr>
+    </w:lvl>
+    <w:lvl w:ilvl="8" w:tentative="1">
+      <w:start w:val="1"/>
+      <w:numFmt w:val="bullet"/>
+      <w:lvlText w:val=""/>
+      <w:lvlJc w:val="left"/>
+      <w:pPr>
+        <w:tabs>
+          <w:tab w:val="num" w:pos="6480"/>
+        </w:tabs>
+        <w:ind w:left="6480" w:hanging="360"/>
+      </w:pPr>
+      <w:rPr>
+        <w:rFonts w:ascii="Wingdings" w:hAnsi="Wingdings" w:hint="default"/>
+        <w:sz w:val="20"/>
+      </w:rPr>
+    </w:lvl>
+  </w:abstractNum>
+  <w:abstractNum w:abstractNumId="4" w15:restartNumberingAfterBreak="0">
+    <w:nsid w:val="48425354"/>
+    <w:multiLevelType w:val="multilevel"/>
+    <w:tmpl w:val="FA5647A6"/>
+    <w:lvl w:ilvl="0">
+      <w:start w:val="1"/>
+      <w:numFmt w:val="bullet"/>
+      <w:lvlText w:val=""/>
+      <w:lvlJc w:val="left"/>
+      <w:pPr>
+        <w:tabs>
+          <w:tab w:val="num" w:pos="720"/>
+        </w:tabs>
+        <w:ind w:left="720" w:hanging="360"/>
+      </w:pPr>
+      <w:rPr>
+        <w:rFonts w:ascii="Symbol" w:hAnsi="Symbol" w:hint="default"/>
+        <w:sz w:val="20"/>
+      </w:rPr>
+    </w:lvl>
+    <w:lvl w:ilvl="1" w:tentative="1">
+      <w:start w:val="1"/>
+      <w:numFmt w:val="bullet"/>
+      <w:lvlText w:val="o"/>
+      <w:lvlJc w:val="left"/>
+      <w:pPr>
+        <w:tabs>
+          <w:tab w:val="num" w:pos="1440"/>
+        </w:tabs>
+        <w:ind w:left="1440" w:hanging="360"/>
+      </w:pPr>
+      <w:rPr>
+        <w:rFonts w:ascii="Courier New" w:hAnsi="Courier New" w:hint="default"/>
+        <w:sz w:val="20"/>
+      </w:rPr>
+    </w:lvl>
+    <w:lvl w:ilvl="2" w:tentative="1">
+      <w:start w:val="1"/>
+      <w:numFmt w:val="bullet"/>
+      <w:lvlText w:val=""/>
+      <w:lvlJc w:val="left"/>
+      <w:pPr>
+        <w:tabs>
+          <w:tab w:val="num" w:pos="2160"/>
+        </w:tabs>
+        <w:ind w:left="2160" w:hanging="360"/>
+      </w:pPr>
+      <w:rPr>
+        <w:rFonts w:ascii="Wingdings" w:hAnsi="Wingdings" w:hint="default"/>
+        <w:sz w:val="20"/>
+      </w:rPr>
+    </w:lvl>
+    <w:lvl w:ilvl="3" w:tentative="1">
+      <w:start w:val="1"/>
+      <w:numFmt w:val="bullet"/>
+      <w:lvlText w:val=""/>
+      <w:lvlJc w:val="left"/>
+      <w:pPr>
+        <w:tabs>
+          <w:tab w:val="num" w:pos="2880"/>
+        </w:tabs>
+        <w:ind w:left="2880" w:hanging="360"/>
+      </w:pPr>
+      <w:rPr>
+        <w:rFonts w:ascii="Wingdings" w:hAnsi="Wingdings" w:hint="default"/>
+        <w:sz w:val="20"/>
+      </w:rPr>
+    </w:lvl>
+    <w:lvl w:ilvl="4" w:tentative="1">
+      <w:start w:val="1"/>
+      <w:numFmt w:val="bullet"/>
+      <w:lvlText w:val=""/>
+      <w:lvlJc w:val="left"/>
+      <w:pPr>
+        <w:tabs>
+          <w:tab w:val="num" w:pos="3600"/>
+        </w:tabs>
+        <w:ind w:left="3600" w:hanging="360"/>
+      </w:pPr>
+      <w:rPr>
+        <w:rFonts w:ascii="Wingdings" w:hAnsi="Wingdings" w:hint="default"/>
+        <w:sz w:val="20"/>
+      </w:rPr>
+    </w:lvl>
+    <w:lvl w:ilvl="5" w:tentative="1">
+      <w:start w:val="1"/>
+      <w:numFmt w:val="bullet"/>
+      <w:lvlText w:val=""/>
+      <w:lvlJc w:val="left"/>
+      <w:pPr>
+        <w:tabs>
+          <w:tab w:val="num" w:pos="4320"/>
+        </w:tabs>
+        <w:ind w:left="4320" w:hanging="360"/>
+      </w:pPr>
+      <w:rPr>
+        <w:rFonts w:ascii="Wingdings" w:hAnsi="Wingdings" w:hint="default"/>
+        <w:sz w:val="20"/>
+      </w:rPr>
+    </w:lvl>
+    <w:lvl w:ilvl="6" w:tentative="1">
+      <w:start w:val="1"/>
+      <w:numFmt w:val="bullet"/>
+      <w:lvlText w:val=""/>
+      <w:lvlJc w:val="left"/>
+      <w:pPr>
+        <w:tabs>
+          <w:tab w:val="num" w:pos="5040"/>
+        </w:tabs>
+        <w:ind w:left="5040" w:hanging="360"/>
+      </w:pPr>
+      <w:rPr>
+        <w:rFonts w:ascii="Wingdings" w:hAnsi="Wingdings" w:hint="default"/>
+        <w:sz w:val="20"/>
+      </w:rPr>
+    </w:lvl>
+    <w:lvl w:ilvl="7" w:tentative="1">
+      <w:start w:val="1"/>
+      <w:numFmt w:val="bullet"/>
+      <w:lvlText w:val=""/>
+      <w:lvlJc w:val="left"/>
+      <w:pPr>
+        <w:tabs>
+          <w:tab w:val="num" w:pos="5760"/>
+        </w:tabs>
+        <w:ind w:left="5760" w:hanging="360"/>
+      </w:pPr>
+      <w:rPr>
+        <w:rFonts w:ascii="Wingdings" w:hAnsi="Wingdings" w:hint="default"/>
+        <w:sz w:val="20"/>
+      </w:rPr>
+    </w:lvl>
+    <w:lvl w:ilvl="8" w:tentative="1">
+      <w:start w:val="1"/>
+      <w:numFmt w:val="bullet"/>
+      <w:lvlText w:val=""/>
+      <w:lvlJc w:val="left"/>
+      <w:pPr>
+        <w:tabs>
+          <w:tab w:val="num" w:pos="6480"/>
+        </w:tabs>
+        <w:ind w:left="6480" w:hanging="360"/>
+      </w:pPr>
+      <w:rPr>
+        <w:rFonts w:ascii="Wingdings" w:hAnsi="Wingdings" w:hint="default"/>
+        <w:sz w:val="20"/>
+      </w:rPr>
+    </w:lvl>
+  </w:abstractNum>
+  <w:abstractNum w:abstractNumId="5" w15:restartNumberingAfterBreak="0">
+    <w:nsid w:val="4C5D4E2B"/>
+    <w:multiLevelType w:val="multilevel"/>
+    <w:tmpl w:val="31F016EA"/>
+    <w:lvl w:ilvl="0">
+      <w:start w:val="1"/>
+      <w:numFmt w:val="bullet"/>
+      <w:lvlText w:val=""/>
+      <w:lvlJc w:val="left"/>
+      <w:pPr>
+        <w:tabs>
+          <w:tab w:val="num" w:pos="720"/>
+        </w:tabs>
+        <w:ind w:left="720" w:hanging="360"/>
+      </w:pPr>
+      <w:rPr>
+        <w:rFonts w:ascii="Symbol" w:hAnsi="Symbol" w:hint="default"/>
+        <w:sz w:val="20"/>
+      </w:rPr>
+    </w:lvl>
+    <w:lvl w:ilvl="1" w:tentative="1">
+      <w:start w:val="1"/>
+      <w:numFmt w:val="bullet"/>
+      <w:lvlText w:val="o"/>
+      <w:lvlJc w:val="left"/>
+      <w:pPr>
+        <w:tabs>
+          <w:tab w:val="num" w:pos="1440"/>
+        </w:tabs>
+        <w:ind w:left="1440" w:hanging="360"/>
+      </w:pPr>
+      <w:rPr>
+        <w:rFonts w:ascii="Courier New" w:hAnsi="Courier New" w:hint="default"/>
+        <w:sz w:val="20"/>
+      </w:rPr>
+    </w:lvl>
+    <w:lvl w:ilvl="2" w:tentative="1">
+      <w:start w:val="1"/>
+      <w:numFmt w:val="bullet"/>
+      <w:lvlText w:val=""/>
+      <w:lvlJc w:val="left"/>
+      <w:pPr>
+        <w:tabs>
+          <w:tab w:val="num" w:pos="2160"/>
+        </w:tabs>
+        <w:ind w:left="2160" w:hanging="360"/>
+      </w:pPr>
+      <w:rPr>
+        <w:rFonts w:ascii="Wingdings" w:hAnsi="Wingdings" w:hint="default"/>
+        <w:sz w:val="20"/>
+      </w:rPr>
+    </w:lvl>
+    <w:lvl w:ilvl="3" w:tentative="1">
+      <w:start w:val="1"/>
+      <w:numFmt w:val="bullet"/>
+      <w:lvlText w:val=""/>
+      <w:lvlJc w:val="left"/>
+      <w:pPr>
+        <w:tabs>
+          <w:tab w:val="num" w:pos="2880"/>
+        </w:tabs>
+        <w:ind w:left="2880" w:hanging="360"/>
+      </w:pPr>
+      <w:rPr>
+        <w:rFonts w:ascii="Wingdings" w:hAnsi="Wingdings" w:hint="default"/>
+        <w:sz w:val="20"/>
+      </w:rPr>
+    </w:lvl>
+    <w:lvl w:ilvl="4" w:tentative="1">
+      <w:start w:val="1"/>
+      <w:numFmt w:val="bullet"/>
+      <w:lvlText w:val=""/>
+      <w:lvlJc w:val="left"/>
+      <w:pPr>
+        <w:tabs>
+          <w:tab w:val="num" w:pos="3600"/>
+        </w:tabs>
+        <w:ind w:left="3600" w:hanging="360"/>
+      </w:pPr>
+      <w:rPr>
+        <w:rFonts w:ascii="Wingdings" w:hAnsi="Wingdings" w:hint="default"/>
+        <w:sz w:val="20"/>
+      </w:rPr>
+    </w:lvl>
+    <w:lvl w:ilvl="5" w:tentative="1">
+      <w:start w:val="1"/>
+      <w:numFmt w:val="bullet"/>
+      <w:lvlText w:val=""/>
+      <w:lvlJc w:val="left"/>
+      <w:pPr>
+        <w:tabs>
+          <w:tab w:val="num" w:pos="4320"/>
+        </w:tabs>
+        <w:ind w:left="4320" w:hanging="360"/>
+      </w:pPr>
+      <w:rPr>
+        <w:rFonts w:ascii="Wingdings" w:hAnsi="Wingdings" w:hint="default"/>
+        <w:sz w:val="20"/>
+      </w:rPr>
+    </w:lvl>
+    <w:lvl w:ilvl="6" w:tentative="1">
+      <w:start w:val="1"/>
+      <w:numFmt w:val="bullet"/>
+      <w:lvlText w:val=""/>
+      <w:lvlJc w:val="left"/>
+      <w:pPr>
+        <w:tabs>
+          <w:tab w:val="num" w:pos="5040"/>
+        </w:tabs>
+        <w:ind w:left="5040" w:hanging="360"/>
+      </w:pPr>
+      <w:rPr>
+        <w:rFonts w:ascii="Wingdings" w:hAnsi="Wingdings" w:hint="default"/>
+        <w:sz w:val="20"/>
+      </w:rPr>
+    </w:lvl>
+    <w:lvl w:ilvl="7" w:tentative="1">
+      <w:start w:val="1"/>
+      <w:numFmt w:val="bullet"/>
+      <w:lvlText w:val=""/>
+      <w:lvlJc w:val="left"/>
+      <w:pPr>
+        <w:tabs>
+          <w:tab w:val="num" w:pos="5760"/>
+        </w:tabs>
+        <w:ind w:left="5760" w:hanging="360"/>
+      </w:pPr>
+      <w:rPr>
+        <w:rFonts w:ascii="Wingdings" w:hAnsi="Wingdings" w:hint="default"/>
+        <w:sz w:val="20"/>
+      </w:rPr>
+    </w:lvl>
+    <w:lvl w:ilvl="8" w:tentative="1">
+      <w:start w:val="1"/>
+      <w:numFmt w:val="bullet"/>
+      <w:lvlText w:val=""/>
+      <w:lvlJc w:val="left"/>
+      <w:pPr>
+        <w:tabs>
+          <w:tab w:val="num" w:pos="6480"/>
+        </w:tabs>
+        <w:ind w:left="6480" w:hanging="360"/>
+      </w:pPr>
+      <w:rPr>
+        <w:rFonts w:ascii="Wingdings" w:hAnsi="Wingdings" w:hint="default"/>
+        <w:sz w:val="20"/>
+      </w:rPr>
+    </w:lvl>
+  </w:abstractNum>
+  <w:abstractNum w:abstractNumId="6" w15:restartNumberingAfterBreak="0">
+    <w:nsid w:val="5B7145F0"/>
+    <w:multiLevelType w:val="multilevel"/>
+    <w:tmpl w:val="B46AD604"/>
+    <w:lvl w:ilvl="0">
+      <w:start w:val="1"/>
+      <w:numFmt w:val="bullet"/>
+      <w:lvlText w:val=""/>
+      <w:lvlJc w:val="left"/>
+      <w:pPr>
+        <w:tabs>
+          <w:tab w:val="num" w:pos="720"/>
+        </w:tabs>
+        <w:ind w:left="720" w:hanging="360"/>
+      </w:pPr>
+      <w:rPr>
+        <w:rFonts w:ascii="Symbol" w:hAnsi="Symbol" w:hint="default"/>
+        <w:sz w:val="20"/>
+      </w:rPr>
+    </w:lvl>
+    <w:lvl w:ilvl="1" w:tentative="1">
+      <w:start w:val="1"/>
+      <w:numFmt w:val="bullet"/>
+      <w:lvlText w:val="o"/>
+      <w:lvlJc w:val="left"/>
+      <w:pPr>
+        <w:tabs>
+          <w:tab w:val="num" w:pos="1440"/>
+        </w:tabs>
+        <w:ind w:left="1440" w:hanging="360"/>
+      </w:pPr>
+      <w:rPr>
+        <w:rFonts w:ascii="Courier New" w:hAnsi="Courier New" w:hint="default"/>
+        <w:sz w:val="20"/>
+      </w:rPr>
+    </w:lvl>
+    <w:lvl w:ilvl="2" w:tentative="1">
+      <w:start w:val="1"/>
+      <w:numFmt w:val="bullet"/>
+      <w:lvlText w:val=""/>
+      <w:lvlJc w:val="left"/>
+      <w:pPr>
+        <w:tabs>
+          <w:tab w:val="num" w:pos="2160"/>
+        </w:tabs>
+        <w:ind w:left="2160" w:hanging="360"/>
+      </w:pPr>
+      <w:rPr>
+        <w:rFonts w:ascii="Wingdings" w:hAnsi="Wingdings" w:hint="default"/>
+        <w:sz w:val="20"/>
+      </w:rPr>
+    </w:lvl>
+    <w:lvl w:ilvl="3" w:tentative="1">
+      <w:start w:val="1"/>
+      <w:numFmt w:val="bullet"/>
+      <w:lvlText w:val=""/>
+      <w:lvlJc w:val="left"/>
+      <w:pPr>
+        <w:tabs>
+          <w:tab w:val="num" w:pos="2880"/>
+        </w:tabs>
+        <w:ind w:left="2880" w:hanging="360"/>
+      </w:pPr>
+      <w:rPr>
+        <w:rFonts w:ascii="Wingdings" w:hAnsi="Wingdings" w:hint="default"/>
+        <w:sz w:val="20"/>
+      </w:rPr>
+    </w:lvl>
+    <w:lvl w:ilvl="4" w:tentative="1">
+      <w:start w:val="1"/>
+      <w:numFmt w:val="bullet"/>
+      <w:lvlText w:val=""/>
+      <w:lvlJc w:val="left"/>
+      <w:pPr>
+        <w:tabs>
+          <w:tab w:val="num" w:pos="3600"/>
+        </w:tabs>
+        <w:ind w:left="3600" w:hanging="360"/>
+      </w:pPr>
+      <w:rPr>
+        <w:rFonts w:ascii="Wingdings" w:hAnsi="Wingdings" w:hint="default"/>
+        <w:sz w:val="20"/>
+      </w:rPr>
+    </w:lvl>
+    <w:lvl w:ilvl="5" w:tentative="1">
+      <w:start w:val="1"/>
+      <w:numFmt w:val="bullet"/>
+      <w:lvlText w:val=""/>
+      <w:lvlJc w:val="left"/>
+      <w:pPr>
+        <w:tabs>
+          <w:tab w:val="num" w:pos="4320"/>
+        </w:tabs>
+        <w:ind w:left="4320" w:hanging="360"/>
+      </w:pPr>
+      <w:rPr>
+        <w:rFonts w:ascii="Wingdings" w:hAnsi="Wingdings" w:hint="default"/>
+        <w:sz w:val="20"/>
+      </w:rPr>
+    </w:lvl>
+    <w:lvl w:ilvl="6" w:tentative="1">
+      <w:start w:val="1"/>
+      <w:numFmt w:val="bullet"/>
+      <w:lvlText w:val=""/>
+      <w:lvlJc w:val="left"/>
+      <w:pPr>
+        <w:tabs>
+          <w:tab w:val="num" w:pos="5040"/>
+        </w:tabs>
+        <w:ind w:left="5040" w:hanging="360"/>
+      </w:pPr>
+      <w:rPr>
+        <w:rFonts w:ascii="Wingdings" w:hAnsi="Wingdings" w:hint="default"/>
+        <w:sz w:val="20"/>
+      </w:rPr>
+    </w:lvl>
+    <w:lvl w:ilvl="7" w:tentative="1">
+      <w:start w:val="1"/>
+      <w:numFmt w:val="bullet"/>
+      <w:lvlText w:val=""/>
+      <w:lvlJc w:val="left"/>
+      <w:pPr>
+        <w:tabs>
+          <w:tab w:val="num" w:pos="5760"/>
+        </w:tabs>
+        <w:ind w:left="5760" w:hanging="360"/>
+      </w:pPr>
+      <w:rPr>
+        <w:rFonts w:ascii="Wingdings" w:hAnsi="Wingdings" w:hint="default"/>
+        <w:sz w:val="20"/>
+      </w:rPr>
+    </w:lvl>
+    <w:lvl w:ilvl="8" w:tentative="1">
+      <w:start w:val="1"/>
+      <w:numFmt w:val="bullet"/>
+      <w:lvlText w:val=""/>
+      <w:lvlJc w:val="left"/>
+      <w:pPr>
+        <w:tabs>
+          <w:tab w:val="num" w:pos="6480"/>
+        </w:tabs>
+        <w:ind w:left="6480" w:hanging="360"/>
+      </w:pPr>
+      <w:rPr>
+        <w:rFonts w:ascii="Wingdings" w:hAnsi="Wingdings" w:hint="default"/>
+        <w:sz w:val="20"/>
+      </w:rPr>
+    </w:lvl>
+  </w:abstractNum>
+  <w:abstractNum w:abstractNumId="7" w15:restartNumberingAfterBreak="0">
+    <w:nsid w:val="5E007D6B"/>
+    <w:multiLevelType w:val="multilevel"/>
+    <w:tmpl w:val="A372FE14"/>
+    <w:lvl w:ilvl="0">
+      <w:start w:val="1"/>
+      <w:numFmt w:val="bullet"/>
+      <w:lvlText w:val=""/>
+      <w:lvlJc w:val="left"/>
+      <w:pPr>
+        <w:tabs>
+          <w:tab w:val="num" w:pos="720"/>
+        </w:tabs>
+        <w:ind w:left="720" w:hanging="360"/>
+      </w:pPr>
+      <w:rPr>
+        <w:rFonts w:ascii="Symbol" w:hAnsi="Symbol" w:hint="default"/>
+        <w:sz w:val="20"/>
+      </w:rPr>
+    </w:lvl>
+    <w:lvl w:ilvl="1" w:tentative="1">
+      <w:start w:val="1"/>
+      <w:numFmt w:val="bullet"/>
+      <w:lvlText w:val="o"/>
+      <w:lvlJc w:val="left"/>
+      <w:pPr>
+        <w:tabs>
+          <w:tab w:val="num" w:pos="1440"/>
+        </w:tabs>
+        <w:ind w:left="1440" w:hanging="360"/>
+      </w:pPr>
+      <w:rPr>
+        <w:rFonts w:ascii="Courier New" w:hAnsi="Courier New" w:hint="default"/>
+        <w:sz w:val="20"/>
+      </w:rPr>
+    </w:lvl>
+    <w:lvl w:ilvl="2" w:tentative="1">
+      <w:start w:val="1"/>
+      <w:numFmt w:val="bullet"/>
+      <w:lvlText w:val=""/>
+      <w:lvlJc w:val="left"/>
+      <w:pPr>
+        <w:tabs>
+          <w:tab w:val="num" w:pos="2160"/>
+        </w:tabs>
+        <w:ind w:left="2160" w:hanging="360"/>
+      </w:pPr>
+      <w:rPr>
+        <w:rFonts w:ascii="Wingdings" w:hAnsi="Wingdings" w:hint="default"/>
+        <w:sz w:val="20"/>
+      </w:rPr>
+    </w:lvl>
+    <w:lvl w:ilvl="3" w:tentative="1">
+      <w:start w:val="1"/>
+      <w:numFmt w:val="bullet"/>
+      <w:lvlText w:val=""/>
+      <w:lvlJc w:val="left"/>
+      <w:pPr>
+        <w:tabs>
+          <w:tab w:val="num" w:pos="2880"/>
+        </w:tabs>
+        <w:ind w:left="2880" w:hanging="360"/>
+      </w:pPr>
+      <w:rPr>
+        <w:rFonts w:ascii="Wingdings" w:hAnsi="Wingdings" w:hint="default"/>
+        <w:sz w:val="20"/>
+      </w:rPr>
+    </w:lvl>
+    <w:lvl w:ilvl="4" w:tentative="1">
+      <w:start w:val="1"/>
+      <w:numFmt w:val="bullet"/>
+      <w:lvlText w:val=""/>
+      <w:lvlJc w:val="left"/>
+      <w:pPr>
+        <w:tabs>
+          <w:tab w:val="num" w:pos="3600"/>
+        </w:tabs>
+        <w:ind w:left="3600" w:hanging="360"/>
+      </w:pPr>
+      <w:rPr>
+        <w:rFonts w:ascii="Wingdings" w:hAnsi="Wingdings" w:hint="default"/>
+        <w:sz w:val="20"/>
+      </w:rPr>
+    </w:lvl>
+    <w:lvl w:ilvl="5" w:tentative="1">
+      <w:start w:val="1"/>
+      <w:numFmt w:val="bullet"/>
+      <w:lvlText w:val=""/>
+      <w:lvlJc w:val="left"/>
+      <w:pPr>
+        <w:tabs>
+          <w:tab w:val="num" w:pos="4320"/>
+        </w:tabs>
+        <w:ind w:left="4320" w:hanging="360"/>
+      </w:pPr>
+      <w:rPr>
+        <w:rFonts w:ascii="Wingdings" w:hAnsi="Wingdings" w:hint="default"/>
+        <w:sz w:val="20"/>
+      </w:rPr>
+    </w:lvl>
+    <w:lvl w:ilvl="6" w:tentative="1">
+      <w:start w:val="1"/>
+      <w:numFmt w:val="bullet"/>
+      <w:lvlText w:val=""/>
+      <w:lvlJc w:val="left"/>
+      <w:pPr>
+        <w:tabs>
+          <w:tab w:val="num" w:pos="5040"/>
+        </w:tabs>
+        <w:ind w:left="5040" w:hanging="360"/>
+      </w:pPr>
+      <w:rPr>
+        <w:rFonts w:ascii="Wingdings" w:hAnsi="Wingdings" w:hint="default"/>
+        <w:sz w:val="20"/>
+      </w:rPr>
+    </w:lvl>
+    <w:lvl w:ilvl="7" w:tentative="1">
+      <w:start w:val="1"/>
+      <w:numFmt w:val="bullet"/>
+      <w:lvlText w:val=""/>
+      <w:lvlJc w:val="left"/>
+      <w:pPr>
+        <w:tabs>
+          <w:tab w:val="num" w:pos="5760"/>
+        </w:tabs>
+        <w:ind w:left="5760" w:hanging="360"/>
+      </w:pPr>
+      <w:rPr>
+        <w:rFonts w:ascii="Wingdings" w:hAnsi="Wingdings" w:hint="default"/>
+        <w:sz w:val="20"/>
+      </w:rPr>
+    </w:lvl>
+    <w:lvl w:ilvl="8" w:tentative="1">
+      <w:start w:val="1"/>
+      <w:numFmt w:val="bullet"/>
+      <w:lvlText w:val=""/>
+      <w:lvlJc w:val="left"/>
+      <w:pPr>
+        <w:tabs>
+          <w:tab w:val="num" w:pos="6480"/>
+        </w:tabs>
+        <w:ind w:left="6480" w:hanging="360"/>
+      </w:pPr>
+      <w:rPr>
+        <w:rFonts w:ascii="Wingdings" w:hAnsi="Wingdings" w:hint="default"/>
+        <w:sz w:val="20"/>
+      </w:rPr>
+    </w:lvl>
+  </w:abstractNum>
   <w:num w:numId="1" w16cid:durableId="780955861">
     <w:abstractNumId w:val="0"/>
+  </w:num>
+  <w:num w:numId="2" w16cid:durableId="1844322630">
+    <w:abstractNumId w:val="3"/>
+  </w:num>
+  <w:num w:numId="3" w16cid:durableId="1522822175">
+    <w:abstractNumId w:val="1"/>
+  </w:num>
+  <w:num w:numId="4" w16cid:durableId="907301552">
+    <w:abstractNumId w:val="5"/>
+  </w:num>
+  <w:num w:numId="5" w16cid:durableId="1844125114">
+    <w:abstractNumId w:val="6"/>
+  </w:num>
+  <w:num w:numId="6" w16cid:durableId="203836906">
+    <w:abstractNumId w:val="2"/>
+  </w:num>
+  <w:num w:numId="7" w16cid:durableId="2082485332">
+    <w:abstractNumId w:val="7"/>
+  </w:num>
+  <w:num w:numId="8" w16cid:durableId="2106538721">
+    <w:abstractNumId w:val="4"/>
   </w:num>
 </w:numbering>
 </file>
@@ -3874,6 +5703,50 @@
     <w:lsdException w:name="Strong" w:qFormat="1"/>
     <w:lsdException w:name="Emphasis" w:qFormat="1"/>
     <w:lsdException w:name="Normal (Web)" w:uiPriority="99"/>
+    <w:lsdException w:name="Normal Table" w:semiHidden="1" w:unhideWhenUsed="1"/>
+    <w:lsdException w:name="Table Simple 1" w:semiHidden="1" w:unhideWhenUsed="1"/>
+    <w:lsdException w:name="Table Simple 2" w:semiHidden="1" w:unhideWhenUsed="1"/>
+    <w:lsdException w:name="Table Simple 3" w:semiHidden="1" w:unhideWhenUsed="1"/>
+    <w:lsdException w:name="Table Classic 1" w:semiHidden="1" w:unhideWhenUsed="1"/>
+    <w:lsdException w:name="Table Classic 2" w:semiHidden="1" w:unhideWhenUsed="1"/>
+    <w:lsdException w:name="Table Classic 3" w:semiHidden="1" w:unhideWhenUsed="1"/>
+    <w:lsdException w:name="Table Classic 4" w:semiHidden="1" w:unhideWhenUsed="1"/>
+    <w:lsdException w:name="Table Colorful 1" w:semiHidden="1" w:unhideWhenUsed="1"/>
+    <w:lsdException w:name="Table Colorful 2" w:semiHidden="1" w:unhideWhenUsed="1"/>
+    <w:lsdException w:name="Table Colorful 3" w:semiHidden="1" w:unhideWhenUsed="1"/>
+    <w:lsdException w:name="Table Columns 1" w:semiHidden="1" w:unhideWhenUsed="1"/>
+    <w:lsdException w:name="Table Columns 2" w:semiHidden="1" w:unhideWhenUsed="1"/>
+    <w:lsdException w:name="Table Columns 3" w:semiHidden="1" w:unhideWhenUsed="1"/>
+    <w:lsdException w:name="Table Columns 4" w:semiHidden="1" w:unhideWhenUsed="1"/>
+    <w:lsdException w:name="Table Columns 5" w:semiHidden="1" w:unhideWhenUsed="1"/>
+    <w:lsdException w:name="Table Grid 1" w:semiHidden="1" w:unhideWhenUsed="1"/>
+    <w:lsdException w:name="Table Grid 2" w:semiHidden="1" w:unhideWhenUsed="1"/>
+    <w:lsdException w:name="Table Grid 3" w:semiHidden="1" w:unhideWhenUsed="1"/>
+    <w:lsdException w:name="Table Grid 4" w:semiHidden="1" w:unhideWhenUsed="1"/>
+    <w:lsdException w:name="Table Grid 5" w:semiHidden="1" w:unhideWhenUsed="1"/>
+    <w:lsdException w:name="Table Grid 6" w:semiHidden="1" w:unhideWhenUsed="1"/>
+    <w:lsdException w:name="Table Grid 7" w:semiHidden="1" w:unhideWhenUsed="1"/>
+    <w:lsdException w:name="Table Grid 8" w:semiHidden="1" w:unhideWhenUsed="1"/>
+    <w:lsdException w:name="Table List 1" w:semiHidden="1" w:unhideWhenUsed="1"/>
+    <w:lsdException w:name="Table List 2" w:semiHidden="1" w:unhideWhenUsed="1"/>
+    <w:lsdException w:name="Table List 3" w:semiHidden="1" w:unhideWhenUsed="1"/>
+    <w:lsdException w:name="Table List 4" w:semiHidden="1" w:unhideWhenUsed="1"/>
+    <w:lsdException w:name="Table List 5" w:semiHidden="1" w:unhideWhenUsed="1"/>
+    <w:lsdException w:name="Table List 6" w:semiHidden="1" w:unhideWhenUsed="1"/>
+    <w:lsdException w:name="Table List 7" w:semiHidden="1" w:unhideWhenUsed="1"/>
+    <w:lsdException w:name="Table List 8" w:semiHidden="1" w:unhideWhenUsed="1"/>
+    <w:lsdException w:name="Table 3D effects 1" w:semiHidden="1" w:unhideWhenUsed="1"/>
+    <w:lsdException w:name="Table 3D effects 2" w:semiHidden="1" w:unhideWhenUsed="1"/>
+    <w:lsdException w:name="Table 3D effects 3" w:semiHidden="1" w:unhideWhenUsed="1"/>
+    <w:lsdException w:name="Table Contemporary" w:semiHidden="1" w:unhideWhenUsed="1"/>
+    <w:lsdException w:name="Table Elegant" w:semiHidden="1" w:unhideWhenUsed="1"/>
+    <w:lsdException w:name="Table Professional" w:semiHidden="1" w:unhideWhenUsed="1"/>
+    <w:lsdException w:name="Table Subtle 1" w:semiHidden="1" w:unhideWhenUsed="1"/>
+    <w:lsdException w:name="Table Subtle 2" w:semiHidden="1" w:unhideWhenUsed="1"/>
+    <w:lsdException w:name="Table Web 1" w:semiHidden="1" w:unhideWhenUsed="1"/>
+    <w:lsdException w:name="Table Web 2" w:semiHidden="1" w:unhideWhenUsed="1"/>
+    <w:lsdException w:name="Table Web 3" w:semiHidden="1" w:unhideWhenUsed="1"/>
+    <w:lsdException w:name="Table Theme" w:semiHidden="1" w:unhideWhenUsed="1"/>
     <w:lsdException w:name="Placeholder Text" w:semiHidden="1" w:uiPriority="99"/>
     <w:lsdException w:name="No Spacing" w:uiPriority="1" w:qFormat="1"/>
     <w:lsdException w:name="Light Shading" w:uiPriority="60"/>
@@ -4285,11 +6158,14 @@
   </w:style>
   <w:style w:type="character" w:default="1" w:styleId="DefaultParagraphFont">
     <w:name w:val="Default Paragraph Font"/>
-    <w:semiHidden/>
+    <w:uiPriority w:val="1"/>
+    <w:unhideWhenUsed/>
   </w:style>
   <w:style w:type="table" w:default="1" w:styleId="TableNormal">
     <w:name w:val="Normal Table"/>
+    <w:uiPriority w:val="99"/>
     <w:semiHidden/>
+    <w:unhideWhenUsed/>
     <w:tblPr>
       <w:tblInd w:w="0" w:type="dxa"/>
       <w:tblCellMar>
@@ -4302,7 +6178,9 @@
   </w:style>
   <w:style w:type="numbering" w:default="1" w:styleId="NoList">
     <w:name w:val="No List"/>
+    <w:uiPriority w:val="99"/>
     <w:semiHidden/>
+    <w:unhideWhenUsed/>
   </w:style>
   <w:style w:type="paragraph" w:styleId="Footer">
     <w:name w:val="footer"/>

</xml_diff>